<commit_message>
Refresh assignment Word report with current repository evidence
</commit_message>
<xml_diff>
--- a/docs/Git_Workflow_Report.docx
+++ b/docs/Git_Workflow_Report.docx
@@ -4,7 +4,7 @@
   <w:body>
     <w:p>
       <w:pPr>
-        <w:spacing w:after="80" w:before="200"/>
+        <w:spacing w:after="60" w:before="160"/>
         <w:jc w:val="center"/>
       </w:pPr>
       <w:r>
@@ -16,12 +16,12 @@
           <w:sz w:val="20"/>
           <w:szCs w:val="20"/>
         </w:rPr>
-        <w:t xml:space="preserve">SOFTWARE PROJECT</w:t>
-      </w:r>
-    </w:p>
-    <w:p>
-      <w:pPr>
-        <w:spacing w:after="80"/>
+        <w:t xml:space="preserve">SOFTWARE PROJECT  /  VERSION CONTROL</w:t>
+      </w:r>
+    </w:p>
+    <w:p>
+      <w:pPr>
+        <w:spacing w:after="60"/>
         <w:jc w:val="center"/>
       </w:pPr>
       <w:r>
@@ -41,7 +41,7 @@
         <w:pBdr>
           <w:bottom w:val="single" w:color="8A6D3B" w:sz="16" w:space="10"/>
         </w:pBdr>
-        <w:spacing w:after="280"/>
+        <w:spacing w:after="240"/>
         <w:jc w:val="center"/>
       </w:pPr>
       <w:r>
@@ -49,11 +49,11 @@
           <w:rFonts w:ascii="Arial" w:cs="Arial" w:eastAsia="Arial" w:hAnsi="Arial"/>
           <w:i/>
           <w:iCs/>
-          <w:color w:val="555555"/>
-          <w:sz w:val="22"/>
-          <w:szCs w:val="22"/>
-        </w:rPr>
-        <w:t xml:space="preserve">Commits, branches, conflict, recovery, and release</w:t>
+          <w:color w:val="4A4A4A"/>
+          <w:sz w:val="22"/>
+          <w:szCs w:val="22"/>
+        </w:rPr>
+        <w:t xml:space="preserve">Feature branches, merge conflict, undo/recovery, and release tag</w:t>
       </w:r>
     </w:p>
     <w:tbl>
@@ -202,7 +202,7 @@
                 <w:sz w:val="18"/>
                 <w:szCs w:val="18"/>
               </w:rPr>
-              <w:t xml:space="preserve">Lumière Restaurant Website</w:t>
+              <w:t xml:space="preserve">Lumiere Restaurant Website</w:t>
             </w:r>
           </w:p>
         </w:tc>
@@ -302,7 +302,7 @@
                 <w:sz w:val="18"/>
                 <w:szCs w:val="18"/>
               </w:rPr>
-              <w:t xml:space="preserve">Student</w:t>
+              <w:t xml:space="preserve">GitHub account</w:t>
             </w:r>
           </w:p>
         </w:tc>
@@ -334,7 +334,7 @@
                 <w:sz w:val="18"/>
                 <w:szCs w:val="18"/>
               </w:rPr>
-              <w:t xml:space="preserve">Sazzat Zilan Sifat</w:t>
+              <w:t xml:space="preserve">sayem4</w:t>
             </w:r>
           </w:p>
         </w:tc>
@@ -466,7 +466,7 @@
                 <w:sz w:val="18"/>
                 <w:szCs w:val="18"/>
               </w:rPr>
-              <w:t xml:space="preserve">v1.0.0  →  commit 0d76397</w:t>
+              <w:t xml:space="preserve">v1.0.0  (commit 0d76397)</w:t>
             </w:r>
           </w:p>
         </w:tc>
@@ -500,7 +500,7 @@
                 <w:sz w:val="18"/>
                 <w:szCs w:val="18"/>
               </w:rPr>
-              <w:t xml:space="preserve">HEAD at writing</w:t>
+              <w:t xml:space="preserve">Current main</w:t>
             </w:r>
           </w:p>
         </w:tc>
@@ -532,7 +532,7 @@
                 <w:sz w:val="18"/>
                 <w:szCs w:val="18"/>
               </w:rPr>
-              <w:t xml:space="preserve">1c9a84e  Merge practice/undo-recovery into main</w:t>
+              <w:t xml:space="preserve">a528fb7  Merge origin/main before publishing assignment report</w:t>
             </w:r>
           </w:p>
         </w:tc>
@@ -550,24 +550,6 @@
       <w:r>
         <w:rPr>
           <w:rFonts w:ascii="Arial" w:cs="Arial" w:eastAsia="Arial" w:hAnsi="Arial"/>
-          <w:b w:val="false"/>
-          <w:bCs w:val="false"/>
-          <w:i w:val="false"/>
-          <w:iCs w:val="false"/>
-          <w:color w:val="222222"/>
-          <w:sz w:val="22"/>
-          <w:szCs w:val="22"/>
-        </w:rPr>
-        <w:t xml:space="preserve">This report describes the Git workflow used on the Lumière Restaurant Website. Every hash, branch name, tag, and command listing below was taken from the live repository. A marker who clones the project and runs the required Git commands will see the same objects.</w:t>
-      </w:r>
-    </w:p>
-    <w:p>
-      <w:pPr>
-        <w:spacing w:after="200"/>
-      </w:pPr>
-      <w:r>
-        <w:rPr>
-          <w:rFonts w:ascii="Arial" w:cs="Arial" w:eastAsia="Arial" w:hAnsi="Arial"/>
           <w:b/>
           <w:bCs/>
           <w:color w:val="222222"/>
@@ -576,7 +558,12 @@
         </w:rPr>
         <w:t xml:space="preserve">Repository link: </w:t>
       </w:r>
-      <w:hyperlink w:history="1" r:id="rIdwwstnd9s8b08ikkgyrubi">
+    </w:p>
+    <w:p>
+      <w:pPr>
+        <w:spacing w:after="160"/>
+      </w:pPr>
+      <w:hyperlink w:history="1" r:id="rIdoqyovyrps1pjirqvdpbxg">
         <w:r>
           <w:rPr>
             <w:rStyle w:val="Hyperlink"/>
@@ -590,11 +577,29 @@
     </w:p>
     <w:p>
       <w:pPr>
+        <w:spacing w:after="160" w:before="0" w:line="276"/>
+      </w:pPr>
+      <w:r>
+        <w:rPr>
+          <w:rFonts w:ascii="Arial" w:cs="Arial" w:eastAsia="Arial" w:hAnsi="Arial"/>
+          <w:b w:val="false"/>
+          <w:bCs w:val="false"/>
+          <w:i w:val="false"/>
+          <w:iCs w:val="false"/>
+          <w:color w:val="222222"/>
+          <w:sz w:val="22"/>
+          <w:szCs w:val="22"/>
+        </w:rPr>
+        <w:t xml:space="preserve">This report describes the Git workflow used on that repository. Every hash, branch, tag, and command listing below was taken from the live clone. A marker who opens the GitHub project and runs the required Git commands will see the same objects.</w:t>
+      </w:r>
+    </w:p>
+    <w:p>
+      <w:pPr>
         <w:pStyle w:val="Heading1"/>
         <w:pBdr>
           <w:bottom w:val="single" w:color="8A6D3B" w:sz="12" w:space="4"/>
         </w:pBdr>
-        <w:spacing w:after="200" w:before="320"/>
+        <w:spacing w:after="180" w:before="280"/>
       </w:pPr>
       <w:r>
         <w:rPr>
@@ -623,7 +628,7 @@
           <w:sz w:val="22"/>
           <w:szCs w:val="22"/>
         </w:rPr>
-        <w:t xml:space="preserve">Lumière is a restaurant web application. It presents a brand homepage, a category menu, table reservations, guest testimonials, and an authenticated admin toolbar so staff can edit site content without opening the source files.</w:t>
+        <w:t xml:space="preserve">Lumiere is a restaurant web application. It presents a brand homepage, a category menu, table reservations, guest testimonials, and an authenticated admin toolbar so staff can edit site content without opening the source files.</w:t>
       </w:r>
     </w:p>
     <w:p>
@@ -677,7 +682,7 @@
           <w:sz w:val="22"/>
           <w:szCs w:val="22"/>
         </w:rPr>
-        <w:t xml:space="preserve">The first commit on the remote is fe8616e (Initial commit for GitHub Pages deployment). The Pages workflow was corrected in ce123e6. Feature work was then split onto three branches, merged back to main, a merge conflict was created and resolved in the README, a release was tagged as v1.0.0 at 0d76397, and a later Pages black-screen fix landed in 67f4658. Undo and recovery were practised on practice/undo-recovery and merged in 1c9a84e.</w:t>
+        <w:t xml:space="preserve">The first commit on the remote is fe8616e (Initial commit for GitHub Pages deployment). The Pages workflow was corrected in ce123e6. Feature work was then split onto three branches, merged back to main, a merge conflict was created and resolved in the README, and a release was tagged as v1.0.0 at 0d76397. Later Pages fixes landed in 67f4658 and 07fcdd6. Undo and recovery were practised on practice/undo-recovery (261005b, 8712897, 8300196) and merged in 1c9a84e. This report itself is commit b6815cb. Current main is a528fb7.</w:t>
       </w:r>
     </w:p>
     <w:p>
@@ -686,7 +691,7 @@
         <w:pBdr>
           <w:bottom w:val="single" w:color="8A6D3B" w:sz="12" w:space="4"/>
         </w:pBdr>
-        <w:spacing w:after="200" w:before="320"/>
+        <w:spacing w:after="180" w:before="280"/>
       </w:pPr>
       <w:r>
         <w:rPr>
@@ -715,7 +720,7 @@
           <w:sz w:val="22"/>
           <w:szCs w:val="22"/>
         </w:rPr>
-        <w:t xml:space="preserve">The team treated main as the integration branch. New work was not piled onto main as a single linear dump. The project followed a small feature-branch workflow:</w:t>
+        <w:t xml:space="preserve">main is the integration branch. New work was not piled onto main as a single linear dump. The project followed a small feature-branch workflow:</w:t>
       </w:r>
     </w:p>
     <w:p>
@@ -982,7 +987,7 @@
                 <w:sz w:val="18"/>
                 <w:szCs w:val="18"/>
               </w:rPr>
-              <w:t xml:space="preserve">feature/homepage-ui  →  main</w:t>
+              <w:t xml:space="preserve">feature/homepage-ui  into  main</w:t>
             </w:r>
           </w:p>
         </w:tc>
@@ -1048,7 +1053,7 @@
                 <w:sz w:val="18"/>
                 <w:szCs w:val="18"/>
               </w:rPr>
-              <w:t xml:space="preserve">feature/auth-flow  →  main</w:t>
+              <w:t xml:space="preserve">feature/auth-flow  into  main</w:t>
             </w:r>
           </w:p>
         </w:tc>
@@ -1114,7 +1119,7 @@
                 <w:sz w:val="18"/>
                 <w:szCs w:val="18"/>
               </w:rPr>
-              <w:t xml:space="preserve">feature/local-hosting  →  main</w:t>
+              <w:t xml:space="preserve">feature/local-hosting  into  main</w:t>
             </w:r>
           </w:p>
         </w:tc>
@@ -1176,7 +1181,7 @@
           <w:sz w:val="22"/>
           <w:szCs w:val="22"/>
         </w:rPr>
-        <w:t xml:space="preserve">Release discipline is a lightweight tag, not a rewrite. 0d76397 is chore(release): 1.0.0 and is pointed to by tag v1.0.0. After the tag, 67f4658 fixed a GitHub Pages black screen by serving the compiled app. Recovery practice then used a dedicated branch so main was only updated by a merge (1c9a84e), not by a hard reset.</w:t>
+        <w:t xml:space="preserve">Release discipline is a lightweight tag, not a rewrite. 0d76397 is chore(release): 1.0.0 and is pointed to by tag v1.0.0. After the tag, hosting fixes and a recovery exercise continued on main. Recovery used a dedicated branch so main was only updated by a merge (1c9a84e), not by a hard reset.</w:t>
       </w:r>
     </w:p>
     <w:p>
@@ -1194,7 +1199,7 @@
           <w:sz w:val="22"/>
           <w:szCs w:val="22"/>
         </w:rPr>
-        <w:t xml:space="preserve">Commit messages are short and say why the snapshot exists: “Merge feature/auth-flow into main”, “Resolve merge conflict in README”, “Revert …”, “chore(release): 1.0.0”. That makes git log --oneline --graph --decorate --all usable as a narrative, which is the point of this assignment.</w:t>
+        <w:t xml:space="preserve">Commit messages are short and say why the snapshot exists: Merge feature/auth-flow into main, Resolve merge conflict in README, Revert ..., chore(release): 1.0.0. That makes git log --oneline --graph --decorate --all usable as a narrative.</w:t>
       </w:r>
     </w:p>
     <w:p>
@@ -1203,7 +1208,7 @@
         <w:pBdr>
           <w:bottom w:val="single" w:color="8A6D3B" w:sz="12" w:space="4"/>
         </w:pBdr>
-        <w:spacing w:after="200" w:before="320"/>
+        <w:spacing w:after="180" w:before="280"/>
       </w:pPr>
       <w:r>
         <w:rPr>
@@ -1214,13 +1219,13 @@
           <w:sz w:val="28"/>
           <w:szCs w:val="28"/>
         </w:rPr>
-        <w:t xml:space="preserve">3. Summary of the three feature branches</w:t>
+        <w:t xml:space="preserve">3. Summary of the 3 feature branches</w:t>
       </w:r>
     </w:p>
     <w:p>
       <w:pPr>
         <w:pStyle w:val="Heading2"/>
-        <w:spacing w:after="140" w:before="240"/>
+        <w:spacing w:after="120" w:before="220"/>
       </w:pPr>
       <w:r>
         <w:rPr>
@@ -1256,7 +1261,7 @@
           <w:sz w:val="22"/>
           <w:szCs w:val="22"/>
         </w:rPr>
-        <w:t xml:space="preserve">Isolate homepage and chrome work — hero, menu browsing, gallery, testimonials, contact, navbar and footer — from auth and hosting changes.</w:t>
+        <w:t xml:space="preserve">Isolate homepage and chrome work (hero, menu browsing, gallery, testimonials, contact, navbar and footer) from auth and hosting changes.</w:t>
       </w:r>
     </w:p>
     <w:p>
@@ -1281,7 +1286,7 @@
           <w:sz w:val="22"/>
           <w:szCs w:val="22"/>
         </w:rPr>
-        <w:t xml:space="preserve">d39aed6 uploaded the branch material from the previous mainline. d4e0860 added a README note: “This branch focuses on homepage UI improvements.” d102f7b merged the branch into main.</w:t>
+        <w:t xml:space="preserve">d39aed6 uploaded the branch material. d4e0860 added a README note: This branch focuses on homepage UI improvements. d102f7b merged the branch into main.</w:t>
       </w:r>
     </w:p>
     <w:p>
@@ -1309,21 +1314,28 @@
       <w:r>
         <w:rPr>
           <w:rFonts w:ascii="Arial" w:cs="Arial" w:eastAsia="Arial" w:hAnsi="Arial"/>
-          <w:b w:val="false"/>
-          <w:bCs w:val="false"/>
-          <w:i w:val="false"/>
-          <w:iCs w:val="false"/>
-          <w:color w:val="222222"/>
-          <w:sz w:val="22"/>
-          <w:szCs w:val="22"/>
-        </w:rPr>
-        <w:t xml:space="preserve">The branch tip is still visible as origin/feature/homepage-ui at d4e0860, which is what a marker sees in git branch -a.</w:t>
+          <w:b/>
+          <w:bCs/>
+          <w:color w:val="222222"/>
+          <w:sz w:val="22"/>
+          <w:szCs w:val="22"/>
+        </w:rPr>
+        <w:t xml:space="preserve">Merge. </w:t>
+      </w:r>
+      <w:r>
+        <w:rPr>
+          <w:rFonts w:ascii="Arial" w:cs="Arial" w:eastAsia="Arial" w:hAnsi="Arial"/>
+          <w:color w:val="222222"/>
+          <w:sz w:val="22"/>
+          <w:szCs w:val="22"/>
+        </w:rPr>
+        <w:t xml:space="preserve">d102f7b. The branch tip is still visible as origin/feature/homepage-ui at d4e0860, which is what a marker sees in git branch -a.</w:t>
       </w:r>
     </w:p>
     <w:p>
       <w:pPr>
         <w:pStyle w:val="Heading2"/>
-        <w:spacing w:after="140" w:before="240"/>
+        <w:spacing w:after="120" w:before="220"/>
       </w:pPr>
       <w:r>
         <w:rPr>
@@ -1384,7 +1396,7 @@
           <w:sz w:val="22"/>
           <w:szCs w:val="22"/>
         </w:rPr>
-        <w:t xml:space="preserve">727f70c added a README note: “This branch focuses on authentication flow improvements.” 3b228e5 merged the branch into main.</w:t>
+        <w:t xml:space="preserve">727f70c added a README note: This branch focuses on authentication flow improvements. 3b228e5 merged the branch into main.</w:t>
       </w:r>
     </w:p>
     <w:p>
@@ -1402,13 +1414,38 @@
           <w:sz w:val="22"/>
           <w:szCs w:val="22"/>
         </w:rPr>
-        <w:t xml:space="preserve">src/context/AuthContext.tsx exposes signUp, signIn, resetPassword, signOut, and roleFromUser. src/pages/AuthPage.tsx is the form surface. src/components/AdminToolbar.tsx only appears when the signed-in role is allowed to edit. Auth was branched separately because those files change for different reasons than the homepage. origin/feature/auth-flow still points at 727f70c.</w:t>
+        <w:t xml:space="preserve">src/context/AuthContext.tsx exposes signUp, signIn, resetPassword, signOut, and roleFromUser. src/pages/AuthPage.tsx is the form surface. src/components/AdminToolbar.tsx only appears when the signed-in role is allowed to edit. Auth was branched separately because those files change for different reasons than the homepage.</w:t>
+      </w:r>
+    </w:p>
+    <w:p>
+      <w:pPr>
+        <w:spacing w:after="160" w:before="0" w:line="276"/>
+      </w:pPr>
+      <w:r>
+        <w:rPr>
+          <w:rFonts w:ascii="Arial" w:cs="Arial" w:eastAsia="Arial" w:hAnsi="Arial"/>
+          <w:b/>
+          <w:bCs/>
+          <w:color w:val="222222"/>
+          <w:sz w:val="22"/>
+          <w:szCs w:val="22"/>
+        </w:rPr>
+        <w:t xml:space="preserve">Merge. </w:t>
+      </w:r>
+      <w:r>
+        <w:rPr>
+          <w:rFonts w:ascii="Arial" w:cs="Arial" w:eastAsia="Arial" w:hAnsi="Arial"/>
+          <w:color w:val="222222"/>
+          <w:sz w:val="22"/>
+          <w:szCs w:val="22"/>
+        </w:rPr>
+        <w:t xml:space="preserve">3b228e5. origin/feature/auth-flow still points at 727f70c.</w:t>
       </w:r>
     </w:p>
     <w:p>
       <w:pPr>
         <w:pStyle w:val="Heading2"/>
-        <w:spacing w:after="140" w:before="240"/>
+        <w:spacing w:after="120" w:before="220"/>
       </w:pPr>
       <w:r>
         <w:rPr>
@@ -1469,7 +1506,7 @@
           <w:sz w:val="22"/>
           <w:szCs w:val="22"/>
         </w:rPr>
-        <w:t xml:space="preserve">a46126a added a README note: “This branch focuses on local hosting improvements.” 946de78 merged the branch into main.</w:t>
+        <w:t xml:space="preserve">a46126a added a README note: This branch focuses on local hosting improvements. 946de78 merged the branch into main.</w:t>
       </w:r>
     </w:p>
     <w:p>
@@ -1487,7 +1524,32 @@
           <w:sz w:val="22"/>
           <w:szCs w:val="22"/>
         </w:rPr>
-        <w:t xml:space="preserve">src/lib/supabase.ts builds a real client only when VITE_SUPABASE_URL and VITE_SUPABASE_ANON_KEY are set. Otherwise it returns a stub that answers from(), auth.getSession(), and storage calls with empty data instead of throwing. That is why later commits such as 4d5c673 (Critical fix: Allow app to render without Supabase data) and 67f4658 (Fix GitHub Pages black screen by serving the compiled app) could ship a usable Pages site. vite.config.ts and .env.example belong to the same concern. origin/feature/local-hosting remains at a46126a.</w:t>
+        <w:t xml:space="preserve">src/lib/supabase.ts builds a real client only when VITE_SUPABASE_URL and VITE_SUPABASE_ANON_KEY are set. Otherwise it returns a stub that answers from(), auth.getSession(), and storage calls with empty data instead of throwing. That is why later commits such as 4d5c673 (Critical fix: Allow app to render without Supabase data) and 67f4658 / 07fcdd6 (GitHub Pages black-screen fixes) could ship a usable Pages site. vite.config.ts and .env.example belong to the same concern.</w:t>
+      </w:r>
+    </w:p>
+    <w:p>
+      <w:pPr>
+        <w:spacing w:after="160" w:before="0" w:line="276"/>
+      </w:pPr>
+      <w:r>
+        <w:rPr>
+          <w:rFonts w:ascii="Arial" w:cs="Arial" w:eastAsia="Arial" w:hAnsi="Arial"/>
+          <w:b/>
+          <w:bCs/>
+          <w:color w:val="222222"/>
+          <w:sz w:val="22"/>
+          <w:szCs w:val="22"/>
+        </w:rPr>
+        <w:t xml:space="preserve">Merge. </w:t>
+      </w:r>
+      <w:r>
+        <w:rPr>
+          <w:rFonts w:ascii="Arial" w:cs="Arial" w:eastAsia="Arial" w:hAnsi="Arial"/>
+          <w:color w:val="222222"/>
+          <w:sz w:val="22"/>
+          <w:szCs w:val="22"/>
+        </w:rPr>
+        <w:t xml:space="preserve">946de78. origin/feature/local-hosting remains at a46126a.</w:t>
       </w:r>
     </w:p>
     <w:p>
@@ -1514,7 +1576,7 @@
         <w:pBdr>
           <w:bottom w:val="single" w:color="8A6D3B" w:sz="12" w:space="4"/>
         </w:pBdr>
-        <w:spacing w:after="200" w:before="320"/>
+        <w:spacing w:after="180" w:before="280"/>
       </w:pPr>
       <w:r>
         <w:rPr>
@@ -1559,16 +1621,16 @@
           <w:sz w:val="22"/>
           <w:szCs w:val="22"/>
         </w:rPr>
-        <w:t xml:space="preserve">On main — a388209 </w:t>
-      </w:r>
-      <w:r>
-        <w:rPr>
-          <w:rFonts w:ascii="Arial" w:cs="Arial" w:eastAsia="Arial" w:hAnsi="Arial"/>
-          <w:color w:val="222222"/>
-          <w:sz w:val="22"/>
-          <w:szCs w:val="22"/>
-        </w:rPr>
-        <w:t xml:space="preserve">(Add detailed Tech Stack descriptions and Jest testing). The section became a flat list with short explanations: React for component UI, TypeScript for type safety, Vite, Tailwind, Supabase, ESLint, and Jest.</w:t>
+        <w:t xml:space="preserve">On main, commit a388209 </w:t>
+      </w:r>
+      <w:r>
+        <w:rPr>
+          <w:rFonts w:ascii="Arial" w:cs="Arial" w:eastAsia="Arial" w:hAnsi="Arial"/>
+          <w:color w:val="222222"/>
+          <w:sz w:val="22"/>
+          <w:szCs w:val="22"/>
+        </w:rPr>
+        <w:t xml:space="preserve">(Add detailed Tech Stack descriptions and Jest testing) turned the section into a flat list with short explanations: React for component UI, TypeScript for type safety, Vite, Tailwind, Supabase, ESLint, and Jest.</w:t>
       </w:r>
     </w:p>
     <w:p>
@@ -1584,16 +1646,16 @@
           <w:sz w:val="22"/>
           <w:szCs w:val="22"/>
         </w:rPr>
-        <w:t xml:space="preserve">On feature/conflict-demo — 546fed8 </w:t>
-      </w:r>
-      <w:r>
-        <w:rPr>
-          <w:rFonts w:ascii="Arial" w:cs="Arial" w:eastAsia="Arial" w:hAnsi="Arial"/>
-          <w:color w:val="222222"/>
-          <w:sz w:val="22"/>
-          <w:szCs w:val="22"/>
-        </w:rPr>
-        <w:t xml:space="preserve">(Update Tech Stack section with detailed versions). The same section was rewritten as grouped headings (Frontend / Backend / Development Tools) with exact versions (React 18.3.1, Vite 5.4.8, Tailwind 3.4.1).</w:t>
+        <w:t xml:space="preserve">On feature/conflict-demo, commit 546fed8 </w:t>
+      </w:r>
+      <w:r>
+        <w:rPr>
+          <w:rFonts w:ascii="Arial" w:cs="Arial" w:eastAsia="Arial" w:hAnsi="Arial"/>
+          <w:color w:val="222222"/>
+          <w:sz w:val="22"/>
+          <w:szCs w:val="22"/>
+        </w:rPr>
+        <w:t xml:space="preserve">(Update Tech Stack section with detailed versions) rewrote the same section as grouped headings (Frontend / Backend / Development Tools) with exact versions (React 18.3.1, Vite 5.4.8, Tailwind 3.4.1).</w:t>
       </w:r>
     </w:p>
     <w:p>
@@ -1617,14 +1679,14 @@
     <w:p>
       <w:pPr>
         <w:shd w:fill="1E1E1E" w:val="clear"/>
-        <w:spacing w:after="0" w:before="80" w:line="240"/>
-      </w:pPr>
-      <w:r>
-        <w:rPr>
-          <w:rFonts w:ascii="Consolas" w:cs="Consolas" w:eastAsia="Consolas" w:hAnsi="Consolas"/>
-          <w:color w:val="E6EDF3"/>
-          <w:sz w:val="16"/>
-          <w:szCs w:val="16"/>
+        <w:spacing w:after="0" w:before="80" w:line="230"/>
+      </w:pPr>
+      <w:r>
+        <w:rPr>
+          <w:rFonts w:ascii="Consolas" w:cs="Consolas" w:eastAsia="Consolas" w:hAnsi="Consolas"/>
+          <w:color w:val="E6EDF3"/>
+          <w:sz w:val="15"/>
+          <w:szCs w:val="15"/>
         </w:rPr>
         <w:t xml:space="preserve">git merge feature/conflict-demo</w:t>
       </w:r>
@@ -1632,14 +1694,14 @@
     <w:p>
       <w:pPr>
         <w:shd w:fill="1E1E1E" w:val="clear"/>
-        <w:spacing w:after="0" w:before="0" w:line="240"/>
-      </w:pPr>
-      <w:r>
-        <w:rPr>
-          <w:rFonts w:ascii="Consolas" w:cs="Consolas" w:eastAsia="Consolas" w:hAnsi="Consolas"/>
-          <w:color w:val="E6EDF3"/>
-          <w:sz w:val="16"/>
-          <w:szCs w:val="16"/>
+        <w:spacing w:after="0" w:before="0" w:line="230"/>
+      </w:pPr>
+      <w:r>
+        <w:rPr>
+          <w:rFonts w:ascii="Consolas" w:cs="Consolas" w:eastAsia="Consolas" w:hAnsi="Consolas"/>
+          <w:color w:val="E6EDF3"/>
+          <w:sz w:val="15"/>
+          <w:szCs w:val="15"/>
         </w:rPr>
         <w:t xml:space="preserve"> </w:t>
       </w:r>
@@ -1647,14 +1709,14 @@
     <w:p>
       <w:pPr>
         <w:shd w:fill="1E1E1E" w:val="clear"/>
-        <w:spacing w:after="0" w:before="0" w:line="240"/>
-      </w:pPr>
-      <w:r>
-        <w:rPr>
-          <w:rFonts w:ascii="Consolas" w:cs="Consolas" w:eastAsia="Consolas" w:hAnsi="Consolas"/>
-          <w:color w:val="E6EDF3"/>
-          <w:sz w:val="16"/>
-          <w:szCs w:val="16"/>
+        <w:spacing w:after="0" w:before="0" w:line="230"/>
+      </w:pPr>
+      <w:r>
+        <w:rPr>
+          <w:rFonts w:ascii="Consolas" w:cs="Consolas" w:eastAsia="Consolas" w:hAnsi="Consolas"/>
+          <w:color w:val="E6EDF3"/>
+          <w:sz w:val="15"/>
+          <w:szCs w:val="15"/>
         </w:rPr>
         <w:t xml:space="preserve">Auto-merging README.md</w:t>
       </w:r>
@@ -1662,14 +1724,14 @@
     <w:p>
       <w:pPr>
         <w:shd w:fill="1E1E1E" w:val="clear"/>
-        <w:spacing w:after="0" w:before="0" w:line="240"/>
-      </w:pPr>
-      <w:r>
-        <w:rPr>
-          <w:rFonts w:ascii="Consolas" w:cs="Consolas" w:eastAsia="Consolas" w:hAnsi="Consolas"/>
-          <w:color w:val="E6EDF3"/>
-          <w:sz w:val="16"/>
-          <w:szCs w:val="16"/>
+        <w:spacing w:after="0" w:before="0" w:line="230"/>
+      </w:pPr>
+      <w:r>
+        <w:rPr>
+          <w:rFonts w:ascii="Consolas" w:cs="Consolas" w:eastAsia="Consolas" w:hAnsi="Consolas"/>
+          <w:color w:val="E6EDF3"/>
+          <w:sz w:val="15"/>
+          <w:szCs w:val="15"/>
         </w:rPr>
         <w:t xml:space="preserve">CONFLICT (content): Merge conflict in README.md</w:t>
       </w:r>
@@ -1677,14 +1739,14 @@
     <w:p>
       <w:pPr>
         <w:shd w:fill="1E1E1E" w:val="clear"/>
-        <w:spacing w:after="160" w:before="0" w:line="240"/>
-      </w:pPr>
-      <w:r>
-        <w:rPr>
-          <w:rFonts w:ascii="Consolas" w:cs="Consolas" w:eastAsia="Consolas" w:hAnsi="Consolas"/>
-          <w:color w:val="E6EDF3"/>
-          <w:sz w:val="16"/>
-          <w:szCs w:val="16"/>
+        <w:spacing w:after="160" w:before="0" w:line="230"/>
+      </w:pPr>
+      <w:r>
+        <w:rPr>
+          <w:rFonts w:ascii="Consolas" w:cs="Consolas" w:eastAsia="Consolas" w:hAnsi="Consolas"/>
+          <w:color w:val="E6EDF3"/>
+          <w:sz w:val="15"/>
+          <w:szCs w:val="15"/>
         </w:rPr>
         <w:t xml:space="preserve">Automatic merge failed; fix conflicts and then commit the result.</w:t>
       </w:r>
@@ -1710,14 +1772,14 @@
     <w:p>
       <w:pPr>
         <w:shd w:fill="1E1E1E" w:val="clear"/>
-        <w:spacing w:after="0" w:before="80" w:line="240"/>
-      </w:pPr>
-      <w:r>
-        <w:rPr>
-          <w:rFonts w:ascii="Consolas" w:cs="Consolas" w:eastAsia="Consolas" w:hAnsi="Consolas"/>
-          <w:color w:val="E6EDF3"/>
-          <w:sz w:val="16"/>
-          <w:szCs w:val="16"/>
+        <w:spacing w:after="0" w:before="80" w:line="230"/>
+      </w:pPr>
+      <w:r>
+        <w:rPr>
+          <w:rFonts w:ascii="Consolas" w:cs="Consolas" w:eastAsia="Consolas" w:hAnsi="Consolas"/>
+          <w:color w:val="E6EDF3"/>
+          <w:sz w:val="15"/>
+          <w:szCs w:val="15"/>
         </w:rPr>
         <w:t xml:space="preserve">&lt;&lt;&lt;&lt;&lt;&lt;&lt; HEAD</w:t>
       </w:r>
@@ -1725,14 +1787,14 @@
     <w:p>
       <w:pPr>
         <w:shd w:fill="1E1E1E" w:val="clear"/>
-        <w:spacing w:after="0" w:before="0" w:line="240"/>
-      </w:pPr>
-      <w:r>
-        <w:rPr>
-          <w:rFonts w:ascii="Consolas" w:cs="Consolas" w:eastAsia="Consolas" w:hAnsi="Consolas"/>
-          <w:color w:val="E6EDF3"/>
-          <w:sz w:val="16"/>
-          <w:szCs w:val="16"/>
+        <w:spacing w:after="0" w:before="0" w:line="230"/>
+      </w:pPr>
+      <w:r>
+        <w:rPr>
+          <w:rFonts w:ascii="Consolas" w:cs="Consolas" w:eastAsia="Consolas" w:hAnsi="Consolas"/>
+          <w:color w:val="E6EDF3"/>
+          <w:sz w:val="15"/>
+          <w:szCs w:val="15"/>
         </w:rPr>
         <w:t xml:space="preserve">Our technology choices:</w:t>
       </w:r>
@@ -1740,14 +1802,14 @@
     <w:p>
       <w:pPr>
         <w:shd w:fill="1E1E1E" w:val="clear"/>
-        <w:spacing w:after="0" w:before="0" w:line="240"/>
-      </w:pPr>
-      <w:r>
-        <w:rPr>
-          <w:rFonts w:ascii="Consolas" w:cs="Consolas" w:eastAsia="Consolas" w:hAnsi="Consolas"/>
-          <w:color w:val="E6EDF3"/>
-          <w:sz w:val="16"/>
-          <w:szCs w:val="16"/>
+        <w:spacing w:after="0" w:before="0" w:line="230"/>
+      </w:pPr>
+      <w:r>
+        <w:rPr>
+          <w:rFonts w:ascii="Consolas" w:cs="Consolas" w:eastAsia="Consolas" w:hAnsi="Consolas"/>
+          <w:color w:val="E6EDF3"/>
+          <w:sz w:val="15"/>
+          <w:szCs w:val="15"/>
         </w:rPr>
         <w:t xml:space="preserve">- React 18 for component-based UI</w:t>
       </w:r>
@@ -1755,14 +1817,14 @@
     <w:p>
       <w:pPr>
         <w:shd w:fill="1E1E1E" w:val="clear"/>
-        <w:spacing w:after="0" w:before="0" w:line="240"/>
-      </w:pPr>
-      <w:r>
-        <w:rPr>
-          <w:rFonts w:ascii="Consolas" w:cs="Consolas" w:eastAsia="Consolas" w:hAnsi="Consolas"/>
-          <w:color w:val="E6EDF3"/>
-          <w:sz w:val="16"/>
-          <w:szCs w:val="16"/>
+        <w:spacing w:after="0" w:before="0" w:line="230"/>
+      </w:pPr>
+      <w:r>
+        <w:rPr>
+          <w:rFonts w:ascii="Consolas" w:cs="Consolas" w:eastAsia="Consolas" w:hAnsi="Consolas"/>
+          <w:color w:val="E6EDF3"/>
+          <w:sz w:val="15"/>
+          <w:szCs w:val="15"/>
         </w:rPr>
         <w:t xml:space="preserve">...</w:t>
       </w:r>
@@ -1770,14 +1832,14 @@
     <w:p>
       <w:pPr>
         <w:shd w:fill="1E1E1E" w:val="clear"/>
-        <w:spacing w:after="0" w:before="0" w:line="240"/>
-      </w:pPr>
-      <w:r>
-        <w:rPr>
-          <w:rFonts w:ascii="Consolas" w:cs="Consolas" w:eastAsia="Consolas" w:hAnsi="Consolas"/>
-          <w:color w:val="E6EDF3"/>
-          <w:sz w:val="16"/>
-          <w:szCs w:val="16"/>
+        <w:spacing w:after="0" w:before="0" w:line="230"/>
+      </w:pPr>
+      <w:r>
+        <w:rPr>
+          <w:rFonts w:ascii="Consolas" w:cs="Consolas" w:eastAsia="Consolas" w:hAnsi="Consolas"/>
+          <w:color w:val="E6EDF3"/>
+          <w:sz w:val="15"/>
+          <w:szCs w:val="15"/>
         </w:rPr>
         <w:t xml:space="preserve">=======</w:t>
       </w:r>
@@ -1785,14 +1847,14 @@
     <w:p>
       <w:pPr>
         <w:shd w:fill="1E1E1E" w:val="clear"/>
-        <w:spacing w:after="0" w:before="0" w:line="240"/>
-      </w:pPr>
-      <w:r>
-        <w:rPr>
-          <w:rFonts w:ascii="Consolas" w:cs="Consolas" w:eastAsia="Consolas" w:hAnsi="Consolas"/>
-          <w:color w:val="E6EDF3"/>
-          <w:sz w:val="16"/>
-          <w:szCs w:val="16"/>
+        <w:spacing w:after="0" w:before="0" w:line="230"/>
+      </w:pPr>
+      <w:r>
+        <w:rPr>
+          <w:rFonts w:ascii="Consolas" w:cs="Consolas" w:eastAsia="Consolas" w:hAnsi="Consolas"/>
+          <w:color w:val="E6EDF3"/>
+          <w:sz w:val="15"/>
+          <w:szCs w:val="15"/>
         </w:rPr>
         <w:t xml:space="preserve">### Frontend</w:t>
       </w:r>
@@ -1800,14 +1862,14 @@
     <w:p>
       <w:pPr>
         <w:shd w:fill="1E1E1E" w:val="clear"/>
-        <w:spacing w:after="0" w:before="0" w:line="240"/>
-      </w:pPr>
-      <w:r>
-        <w:rPr>
-          <w:rFonts w:ascii="Consolas" w:cs="Consolas" w:eastAsia="Consolas" w:hAnsi="Consolas"/>
-          <w:color w:val="E6EDF3"/>
-          <w:sz w:val="16"/>
-          <w:szCs w:val="16"/>
+        <w:spacing w:after="0" w:before="0" w:line="230"/>
+      </w:pPr>
+      <w:r>
+        <w:rPr>
+          <w:rFonts w:ascii="Consolas" w:cs="Consolas" w:eastAsia="Consolas" w:hAnsi="Consolas"/>
+          <w:color w:val="E6EDF3"/>
+          <w:sz w:val="15"/>
+          <w:szCs w:val="15"/>
         </w:rPr>
         <w:t xml:space="preserve">- React 18.3.1 with TypeScript</w:t>
       </w:r>
@@ -1815,14 +1877,14 @@
     <w:p>
       <w:pPr>
         <w:shd w:fill="1E1E1E" w:val="clear"/>
-        <w:spacing w:after="0" w:before="0" w:line="240"/>
-      </w:pPr>
-      <w:r>
-        <w:rPr>
-          <w:rFonts w:ascii="Consolas" w:cs="Consolas" w:eastAsia="Consolas" w:hAnsi="Consolas"/>
-          <w:color w:val="E6EDF3"/>
-          <w:sz w:val="16"/>
-          <w:szCs w:val="16"/>
+        <w:spacing w:after="0" w:before="0" w:line="230"/>
+      </w:pPr>
+      <w:r>
+        <w:rPr>
+          <w:rFonts w:ascii="Consolas" w:cs="Consolas" w:eastAsia="Consolas" w:hAnsi="Consolas"/>
+          <w:color w:val="E6EDF3"/>
+          <w:sz w:val="15"/>
+          <w:szCs w:val="15"/>
         </w:rPr>
         <w:t xml:space="preserve">...</w:t>
       </w:r>
@@ -1830,14 +1892,14 @@
     <w:p>
       <w:pPr>
         <w:shd w:fill="1E1E1E" w:val="clear"/>
-        <w:spacing w:after="160" w:before="0" w:line="240"/>
-      </w:pPr>
-      <w:r>
-        <w:rPr>
-          <w:rFonts w:ascii="Consolas" w:cs="Consolas" w:eastAsia="Consolas" w:hAnsi="Consolas"/>
-          <w:color w:val="E6EDF3"/>
-          <w:sz w:val="16"/>
-          <w:szCs w:val="16"/>
+        <w:spacing w:after="160" w:before="0" w:line="230"/>
+      </w:pPr>
+      <w:r>
+        <w:rPr>
+          <w:rFonts w:ascii="Consolas" w:cs="Consolas" w:eastAsia="Consolas" w:hAnsi="Consolas"/>
+          <w:color w:val="E6EDF3"/>
+          <w:sz w:val="15"/>
+          <w:szCs w:val="15"/>
         </w:rPr>
         <w:t xml:space="preserve">&gt;&gt;&gt;&gt;&gt;&gt;&gt; feature/conflict-demo</w:t>
       </w:r>
@@ -1857,20 +1919,20 @@
           <w:sz w:val="22"/>
           <w:szCs w:val="22"/>
         </w:rPr>
-        <w:t xml:space="preserve">The fix was a manual combine, not “ours” or “theirs”. The resolved text kept the feature-branch grouping, the version numbers, the descriptions from main, and Jest. Conflict markers were deleted. Then:</w:t>
-      </w:r>
-    </w:p>
-    <w:p>
-      <w:pPr>
-        <w:shd w:fill="1E1E1E" w:val="clear"/>
-        <w:spacing w:after="0" w:before="80" w:line="240"/>
-      </w:pPr>
-      <w:r>
-        <w:rPr>
-          <w:rFonts w:ascii="Consolas" w:cs="Consolas" w:eastAsia="Consolas" w:hAnsi="Consolas"/>
-          <w:color w:val="E6EDF3"/>
-          <w:sz w:val="16"/>
-          <w:szCs w:val="16"/>
+        <w:t xml:space="preserve">The fix was a manual combine, not ours or theirs. The resolved text kept the feature-branch grouping, the version numbers, the descriptions from main, and Jest. Conflict markers were deleted. Then:</w:t>
+      </w:r>
+    </w:p>
+    <w:p>
+      <w:pPr>
+        <w:shd w:fill="1E1E1E" w:val="clear"/>
+        <w:spacing w:after="0" w:before="80" w:line="230"/>
+      </w:pPr>
+      <w:r>
+        <w:rPr>
+          <w:rFonts w:ascii="Consolas" w:cs="Consolas" w:eastAsia="Consolas" w:hAnsi="Consolas"/>
+          <w:color w:val="E6EDF3"/>
+          <w:sz w:val="15"/>
+          <w:szCs w:val="15"/>
         </w:rPr>
         <w:t xml:space="preserve">git add README.md</w:t>
       </w:r>
@@ -1878,14 +1940,14 @@
     <w:p>
       <w:pPr>
         <w:shd w:fill="1E1E1E" w:val="clear"/>
-        <w:spacing w:after="160" w:before="0" w:line="240"/>
-      </w:pPr>
-      <w:r>
-        <w:rPr>
-          <w:rFonts w:ascii="Consolas" w:cs="Consolas" w:eastAsia="Consolas" w:hAnsi="Consolas"/>
-          <w:color w:val="E6EDF3"/>
-          <w:sz w:val="16"/>
-          <w:szCs w:val="16"/>
+        <w:spacing w:after="160" w:before="0" w:line="230"/>
+      </w:pPr>
+      <w:r>
+        <w:rPr>
+          <w:rFonts w:ascii="Consolas" w:cs="Consolas" w:eastAsia="Consolas" w:hAnsi="Consolas"/>
+          <w:color w:val="E6EDF3"/>
+          <w:sz w:val="15"/>
+          <w:szCs w:val="15"/>
         </w:rPr>
         <w:t xml:space="preserve">git commit -m "Resolve merge conflict in README - combine Tech Stack formats"</w:t>
       </w:r>
@@ -1905,7 +1967,7 @@
           <w:sz w:val="22"/>
           <w:szCs w:val="22"/>
         </w:rPr>
-        <w:t xml:space="preserve">That produced merge commit 0c4d1bf, parents a388209 and 546fed8. f06fa27 later added MERGE_CONFLICT_RESOLUTION.md so the incident is reproducible from the repository itself.</w:t>
+        <w:t xml:space="preserve">That produced merge commit 0c4d1bf, parents a388209 and 546fed8. f06fa27 later added MERGE_CONFLICT_RESOLUTION.md so the incident is reproducible from the repository itself. The current README Tech Stack section is the combined result: grouped headings, version numbers, and Jest.</w:t>
       </w:r>
     </w:p>
     <w:p>
@@ -1923,7 +1985,7 @@
           <w:sz w:val="22"/>
           <w:szCs w:val="22"/>
         </w:rPr>
-        <w:t xml:space="preserve">Choosing a combine was the right call. Dropping either side would have lost either the versions or the explanations. A merge commit (rather than a rebase) left the divergence visible in git log --graph, which is what this report needs to show.</w:t>
+        <w:t xml:space="preserve">Choosing a combine was the right call. Dropping either side would have lost either the versions or the explanations. A merge commit, rather than a rebase, left the divergence visible in git log --graph.</w:t>
       </w:r>
     </w:p>
     <w:p>
@@ -1932,7 +1994,7 @@
         <w:pBdr>
           <w:bottom w:val="single" w:color="8A6D3B" w:sz="12" w:space="4"/>
         </w:pBdr>
-        <w:spacing w:after="200" w:before="320"/>
+        <w:spacing w:after="180" w:before="280"/>
       </w:pPr>
       <w:r>
         <w:rPr>
@@ -1967,7 +2029,7 @@
     <w:p>
       <w:pPr>
         <w:pStyle w:val="Heading2"/>
-        <w:spacing w:after="140" w:before="240"/>
+        <w:spacing w:after="120" w:before="220"/>
       </w:pPr>
       <w:r>
         <w:rPr>
@@ -2002,7 +2064,7 @@
     <w:p>
       <w:pPr>
         <w:pStyle w:val="Heading2"/>
-        <w:spacing w:after="140" w:before="240"/>
+        <w:spacing w:after="120" w:before="220"/>
       </w:pPr>
       <w:r>
         <w:rPr>
@@ -2019,14 +2081,14 @@
     <w:p>
       <w:pPr>
         <w:shd w:fill="1E1E1E" w:val="clear"/>
-        <w:spacing w:after="160" w:before="80" w:line="240"/>
-      </w:pPr>
-      <w:r>
-        <w:rPr>
-          <w:rFonts w:ascii="Consolas" w:cs="Consolas" w:eastAsia="Consolas" w:hAnsi="Consolas"/>
-          <w:color w:val="E6EDF3"/>
-          <w:sz w:val="16"/>
-          <w:szCs w:val="16"/>
+        <w:spacing w:after="160" w:before="80" w:line="230"/>
+      </w:pPr>
+      <w:r>
+        <w:rPr>
+          <w:rFonts w:ascii="Consolas" w:cs="Consolas" w:eastAsia="Consolas" w:hAnsi="Consolas"/>
+          <w:color w:val="E6EDF3"/>
+          <w:sz w:val="15"/>
+          <w:szCs w:val="15"/>
         </w:rPr>
         <w:t xml:space="preserve">git reset --hard HEAD~1</w:t>
       </w:r>
@@ -2052,7 +2114,7 @@
     <w:p>
       <w:pPr>
         <w:pStyle w:val="Heading2"/>
-        <w:spacing w:after="140" w:before="240"/>
+        <w:spacing w:after="120" w:before="220"/>
       </w:pPr>
       <w:r>
         <w:rPr>
@@ -2087,14 +2149,14 @@
     <w:p>
       <w:pPr>
         <w:shd w:fill="1E1E1E" w:val="clear"/>
-        <w:spacing w:after="0" w:before="80" w:line="240"/>
-      </w:pPr>
-      <w:r>
-        <w:rPr>
-          <w:rFonts w:ascii="Consolas" w:cs="Consolas" w:eastAsia="Consolas" w:hAnsi="Consolas"/>
-          <w:color w:val="E6EDF3"/>
-          <w:sz w:val="16"/>
-          <w:szCs w:val="16"/>
+        <w:spacing w:after="0" w:before="80" w:line="230"/>
+      </w:pPr>
+      <w:r>
+        <w:rPr>
+          <w:rFonts w:ascii="Consolas" w:cs="Consolas" w:eastAsia="Consolas" w:hAnsi="Consolas"/>
+          <w:color w:val="E6EDF3"/>
+          <w:sz w:val="15"/>
+          <w:szCs w:val="15"/>
         </w:rPr>
         <w:t xml:space="preserve">67f4658 HEAD@{0}: reset: moving to HEAD~1</w:t>
       </w:r>
@@ -2102,14 +2164,14 @@
     <w:p>
       <w:pPr>
         <w:shd w:fill="1E1E1E" w:val="clear"/>
-        <w:spacing w:after="160" w:before="0" w:line="240"/>
-      </w:pPr>
-      <w:r>
-        <w:rPr>
-          <w:rFonts w:ascii="Consolas" w:cs="Consolas" w:eastAsia="Consolas" w:hAnsi="Consolas"/>
-          <w:color w:val="E6EDF3"/>
-          <w:sz w:val="16"/>
-          <w:szCs w:val="16"/>
+        <w:spacing w:after="160" w:before="0" w:line="230"/>
+      </w:pPr>
+      <w:r>
+        <w:rPr>
+          <w:rFonts w:ascii="Consolas" w:cs="Consolas" w:eastAsia="Consolas" w:hAnsi="Consolas"/>
+          <w:color w:val="E6EDF3"/>
+          <w:sz w:val="15"/>
+          <w:szCs w:val="15"/>
         </w:rPr>
         <w:t xml:space="preserve">261005b HEAD@{1}: commit: WIP: accidental file added to demonstrate undo</w:t>
       </w:r>
@@ -2135,7 +2197,7 @@
     <w:p>
       <w:pPr>
         <w:pStyle w:val="Heading2"/>
-        <w:spacing w:after="140" w:before="240"/>
+        <w:spacing w:after="120" w:before="220"/>
       </w:pPr>
       <w:r>
         <w:rPr>
@@ -2170,14 +2232,14 @@
     <w:p>
       <w:pPr>
         <w:shd w:fill="1E1E1E" w:val="clear"/>
-        <w:spacing w:after="160" w:before="80" w:line="240"/>
-      </w:pPr>
-      <w:r>
-        <w:rPr>
-          <w:rFonts w:ascii="Consolas" w:cs="Consolas" w:eastAsia="Consolas" w:hAnsi="Consolas"/>
-          <w:color w:val="E6EDF3"/>
-          <w:sz w:val="16"/>
-          <w:szCs w:val="16"/>
+        <w:spacing w:after="160" w:before="80" w:line="230"/>
+      </w:pPr>
+      <w:r>
+        <w:rPr>
+          <w:rFonts w:ascii="Consolas" w:cs="Consolas" w:eastAsia="Consolas" w:hAnsi="Consolas"/>
+          <w:color w:val="E6EDF3"/>
+          <w:sz w:val="15"/>
+          <w:szCs w:val="15"/>
         </w:rPr>
         <w:t xml:space="preserve">git revert HEAD --no-edit</w:t>
       </w:r>
@@ -2197,7 +2259,7 @@
           <w:sz w:val="22"/>
           <w:szCs w:val="22"/>
         </w:rPr>
-        <w:t xml:space="preserve">That created 8712897 (Revert “WIP: accidental file added to demonstrate undo”). The revert is a new commit that deletes the file. Anyone who already had 261005b can pull 8712897 and stay fast-forward compatible. 8300196 wrote UNDO_RECOVERY.md. 1c9a84e merged the practice branch into main with the ort strategy.</w:t>
+        <w:t xml:space="preserve">That created 8712897 (Revert WIP: accidental file added to demonstrate undo). The revert is a new commit that deletes the file. Anyone who already had 261005b can pull 8712897 and stay fast-forward compatible. 8300196 wrote UNDO_RECOVERY.md. 1c9a84e merged the practice branch into main.</w:t>
       </w:r>
     </w:p>
     <w:p>
@@ -2483,7 +2545,7 @@
                 <w:sz w:val="18"/>
                 <w:szCs w:val="18"/>
               </w:rPr>
-              <w:t xml:space="preserve">Revert — the safe published undo</w:t>
+              <w:t xml:space="preserve">Revert: the safe published undo</w:t>
             </w:r>
           </w:p>
         </w:tc>
@@ -2549,7 +2611,7 @@
                 <w:sz w:val="18"/>
                 <w:szCs w:val="18"/>
               </w:rPr>
-              <w:t xml:space="preserve">Written explanation</w:t>
+              <w:t xml:space="preserve">Written explanation on practice/undo-recovery</w:t>
             </w:r>
           </w:p>
         </w:tc>
@@ -2641,7 +2703,7 @@
           <w:sz w:val="22"/>
           <w:szCs w:val="22"/>
         </w:rPr>
-        <w:t xml:space="preserve">Why this is safe. reflog is a local diary; it does not change commits. reset --hard was confined to a practice branch that had not been the published main tip. The change that actually landed on main is a merge of a revert, so history is additive. No force push was required. The dummy file is absent from the tree at 1c9a84e.</w:t>
+        <w:t xml:space="preserve">Why this is safe. reflog is a local diary; it does not change commits. reset --hard was confined to a practice branch that had not been the published main tip. The change that actually landed on main is a merge of a revert, so history is additive. No force push was required. The dummy file is absent from the tree on current main.</w:t>
       </w:r>
     </w:p>
     <w:p>
@@ -2650,7 +2712,7 @@
         <w:pBdr>
           <w:bottom w:val="single" w:color="8A6D3B" w:sz="12" w:space="4"/>
         </w:pBdr>
-        <w:spacing w:after="200" w:before="320"/>
+        <w:spacing w:after="180" w:before="280"/>
       </w:pPr>
       <w:r>
         <w:rPr>
@@ -2679,20 +2741,35 @@
           <w:sz w:val="22"/>
           <w:szCs w:val="22"/>
         </w:rPr>
-        <w:t xml:space="preserve">git tag -n prints a single annotated pointer:</w:t>
-      </w:r>
-    </w:p>
-    <w:p>
-      <w:pPr>
-        <w:shd w:fill="1E1E1E" w:val="clear"/>
-        <w:spacing w:after="160" w:before="80" w:line="240"/>
-      </w:pPr>
-      <w:r>
-        <w:rPr>
-          <w:rFonts w:ascii="Consolas" w:cs="Consolas" w:eastAsia="Consolas" w:hAnsi="Consolas"/>
-          <w:color w:val="E6EDF3"/>
-          <w:sz w:val="16"/>
-          <w:szCs w:val="16"/>
+        <w:t xml:space="preserve">A named release was created after the feature merges and the conflict resolution:</w:t>
+      </w:r>
+    </w:p>
+    <w:p>
+      <w:pPr>
+        <w:shd w:fill="1E1E1E" w:val="clear"/>
+        <w:spacing w:after="0" w:before="80" w:line="230"/>
+      </w:pPr>
+      <w:r>
+        <w:rPr>
+          <w:rFonts w:ascii="Consolas" w:cs="Consolas" w:eastAsia="Consolas" w:hAnsi="Consolas"/>
+          <w:color w:val="E6EDF3"/>
+          <w:sz w:val="15"/>
+          <w:szCs w:val="15"/>
+        </w:rPr>
+        <w:t xml:space="preserve">git tag -n</w:t>
+      </w:r>
+    </w:p>
+    <w:p>
+      <w:pPr>
+        <w:shd w:fill="1E1E1E" w:val="clear"/>
+        <w:spacing w:after="160" w:before="0" w:line="230"/>
+      </w:pPr>
+      <w:r>
+        <w:rPr>
+          <w:rFonts w:ascii="Consolas" w:cs="Consolas" w:eastAsia="Consolas" w:hAnsi="Consolas"/>
+          <w:color w:val="E6EDF3"/>
+          <w:sz w:val="15"/>
+          <w:szCs w:val="15"/>
         </w:rPr>
         <w:t xml:space="preserve">v1.0.0          chore(release): 1.0.0</w:t>
       </w:r>
@@ -2712,7 +2789,7 @@
           <w:sz w:val="22"/>
           <w:szCs w:val="22"/>
         </w:rPr>
-        <w:t xml:space="preserve">Tag v1.0.0 points at 0d76397. That commit only updates CHANGELOG.md with the 1.0.0 section. The tag is a named pointer, not a copy of the project. Checking out v1.0.0 still builds the restaurant app as it stood on 10 August 2026, before the later Pages fix (67f4658) and the recovery merge (1c9a84e). That is the usual release model: freeze a known snapshot, keep main moving.</w:t>
+        <w:t xml:space="preserve">Tag v1.0.0 points at 0d76397. That commit updates CHANGELOG.md with the 1.0.0 section. The tag is a named pointer, not a copy of the project. Checking out v1.0.0 still builds the restaurant app as it stood on 10 August 2026, before the later Pages fixes and the recovery merge. That is the usual release model: freeze a known snapshot, keep main moving.</w:t>
       </w:r>
     </w:p>
     <w:p>
@@ -2723,7 +2800,7 @@
     <w:p>
       <w:pPr>
         <w:pStyle w:val="Heading2"/>
-        <w:spacing w:after="140" w:before="240"/>
+        <w:spacing w:after="120" w:before="220"/>
       </w:pPr>
       <w:r>
         <w:rPr>
@@ -2752,13 +2829,13 @@
           <w:sz w:val="22"/>
           <w:szCs w:val="22"/>
         </w:rPr>
-        <w:t xml:space="preserve">The four listings below are the live repository at 1c9a84e. Screenshots of the same commands follow each listing.</w:t>
+        <w:t xml:space="preserve">The four listings below are the live repository at a528fb7 (current origin/main). Screenshots of the same commands follow each listing.</w:t>
       </w:r>
     </w:p>
     <w:p>
       <w:pPr>
         <w:pStyle w:val="Heading2"/>
-        <w:spacing w:after="140" w:before="240"/>
+        <w:spacing w:after="120" w:before="220"/>
       </w:pPr>
       <w:r>
         <w:rPr>
@@ -2775,29 +2852,29 @@
     <w:p>
       <w:pPr>
         <w:shd w:fill="1E1E1E" w:val="clear"/>
-        <w:spacing w:after="0" w:before="80" w:line="240"/>
-      </w:pPr>
-      <w:r>
-        <w:rPr>
-          <w:rFonts w:ascii="Consolas" w:cs="Consolas" w:eastAsia="Consolas" w:hAnsi="Consolas"/>
-          <w:color w:val="E6EDF3"/>
-          <w:sz w:val="16"/>
-          <w:szCs w:val="16"/>
-        </w:rPr>
-        <w:t xml:space="preserve">*   1c9a84e (HEAD -&gt; main) Merge practice/undo-recovery into main</w:t>
-      </w:r>
-    </w:p>
-    <w:p>
-      <w:pPr>
-        <w:shd w:fill="1E1E1E" w:val="clear"/>
-        <w:spacing w:after="0" w:before="0" w:line="240"/>
-      </w:pPr>
-      <w:r>
-        <w:rPr>
-          <w:rFonts w:ascii="Consolas" w:cs="Consolas" w:eastAsia="Consolas" w:hAnsi="Consolas"/>
-          <w:color w:val="E6EDF3"/>
-          <w:sz w:val="16"/>
-          <w:szCs w:val="16"/>
+        <w:spacing w:after="0" w:before="80" w:line="230"/>
+      </w:pPr>
+      <w:r>
+        <w:rPr>
+          <w:rFonts w:ascii="Consolas" w:cs="Consolas" w:eastAsia="Consolas" w:hAnsi="Consolas"/>
+          <w:color w:val="E6EDF3"/>
+          <w:sz w:val="15"/>
+          <w:szCs w:val="15"/>
+        </w:rPr>
+        <w:t xml:space="preserve">*   a528fb7 (HEAD -&gt; main, origin/main, origin/HEAD) Merge origin/main before publishing assignment report</w:t>
+      </w:r>
+    </w:p>
+    <w:p>
+      <w:pPr>
+        <w:shd w:fill="1E1E1E" w:val="clear"/>
+        <w:spacing w:after="0" w:before="0" w:line="230"/>
+      </w:pPr>
+      <w:r>
+        <w:rPr>
+          <w:rFonts w:ascii="Consolas" w:cs="Consolas" w:eastAsia="Consolas" w:hAnsi="Consolas"/>
+          <w:color w:val="E6EDF3"/>
+          <w:sz w:val="15"/>
+          <w:szCs w:val="15"/>
         </w:rPr>
         <w:t xml:space="preserve">|\  </w:t>
       </w:r>
@@ -2805,59 +2882,179 @@
     <w:p>
       <w:pPr>
         <w:shd w:fill="1E1E1E" w:val="clear"/>
-        <w:spacing w:after="0" w:before="0" w:line="240"/>
-      </w:pPr>
-      <w:r>
-        <w:rPr>
-          <w:rFonts w:ascii="Consolas" w:cs="Consolas" w:eastAsia="Consolas" w:hAnsi="Consolas"/>
-          <w:color w:val="E6EDF3"/>
-          <w:sz w:val="16"/>
-          <w:szCs w:val="16"/>
-        </w:rPr>
-        <w:t xml:space="preserve">| * 8300196 (practice/undo-recovery) Document undo, reflog recovery, and safe revert</w:t>
-      </w:r>
-    </w:p>
-    <w:p>
-      <w:pPr>
-        <w:shd w:fill="1E1E1E" w:val="clear"/>
-        <w:spacing w:after="0" w:before="0" w:line="240"/>
-      </w:pPr>
-      <w:r>
-        <w:rPr>
-          <w:rFonts w:ascii="Consolas" w:cs="Consolas" w:eastAsia="Consolas" w:hAnsi="Consolas"/>
-          <w:color w:val="E6EDF3"/>
-          <w:sz w:val="16"/>
-          <w:szCs w:val="16"/>
-        </w:rPr>
-        <w:t xml:space="preserve">| * 8712897 Revert "WIP: accidental file added to demonstrate undo"</w:t>
-      </w:r>
-    </w:p>
-    <w:p>
-      <w:pPr>
-        <w:shd w:fill="1E1E1E" w:val="clear"/>
-        <w:spacing w:after="0" w:before="0" w:line="240"/>
-      </w:pPr>
-      <w:r>
-        <w:rPr>
-          <w:rFonts w:ascii="Consolas" w:cs="Consolas" w:eastAsia="Consolas" w:hAnsi="Consolas"/>
-          <w:color w:val="E6EDF3"/>
-          <w:sz w:val="16"/>
-          <w:szCs w:val="16"/>
-        </w:rPr>
-        <w:t xml:space="preserve">| * 261005b WIP: accidental file added to demonstrate undo</w:t>
-      </w:r>
-    </w:p>
-    <w:p>
-      <w:pPr>
-        <w:shd w:fill="1E1E1E" w:val="clear"/>
-        <w:spacing w:after="0" w:before="0" w:line="240"/>
-      </w:pPr>
-      <w:r>
-        <w:rPr>
-          <w:rFonts w:ascii="Consolas" w:cs="Consolas" w:eastAsia="Consolas" w:hAnsi="Consolas"/>
-          <w:color w:val="E6EDF3"/>
-          <w:sz w:val="16"/>
-          <w:szCs w:val="16"/>
+        <w:spacing w:after="0" w:before="0" w:line="230"/>
+      </w:pPr>
+      <w:r>
+        <w:rPr>
+          <w:rFonts w:ascii="Consolas" w:cs="Consolas" w:eastAsia="Consolas" w:hAnsi="Consolas"/>
+          <w:color w:val="E6EDF3"/>
+          <w:sz w:val="15"/>
+          <w:szCs w:val="15"/>
+        </w:rPr>
+        <w:t xml:space="preserve">| * 8e8e1ae Remove temporary write-access check file</w:t>
+      </w:r>
+    </w:p>
+    <w:p>
+      <w:pPr>
+        <w:shd w:fill="1E1E1E" w:val="clear"/>
+        <w:spacing w:after="0" w:before="0" w:line="230"/>
+      </w:pPr>
+      <w:r>
+        <w:rPr>
+          <w:rFonts w:ascii="Consolas" w:cs="Consolas" w:eastAsia="Consolas" w:hAnsi="Consolas"/>
+          <w:color w:val="E6EDF3"/>
+          <w:sz w:val="15"/>
+          <w:szCs w:val="15"/>
+        </w:rPr>
+        <w:t xml:space="preserve">| * 07fcdd6 Fix black GitHub Pages site by serving the compiled app</w:t>
+      </w:r>
+    </w:p>
+    <w:p>
+      <w:pPr>
+        <w:shd w:fill="1E1E1E" w:val="clear"/>
+        <w:spacing w:after="0" w:before="0" w:line="230"/>
+      </w:pPr>
+      <w:r>
+        <w:rPr>
+          <w:rFonts w:ascii="Consolas" w:cs="Consolas" w:eastAsia="Consolas" w:hAnsi="Consolas"/>
+          <w:color w:val="E6EDF3"/>
+          <w:sz w:val="15"/>
+          <w:szCs w:val="15"/>
+        </w:rPr>
+        <w:t xml:space="preserve">| * 2a04a8f perm check write</w:t>
+      </w:r>
+    </w:p>
+    <w:p>
+      <w:pPr>
+        <w:shd w:fill="1E1E1E" w:val="clear"/>
+        <w:spacing w:after="0" w:before="0" w:line="230"/>
+      </w:pPr>
+      <w:r>
+        <w:rPr>
+          <w:rFonts w:ascii="Consolas" w:cs="Consolas" w:eastAsia="Consolas" w:hAnsi="Consolas"/>
+          <w:color w:val="E6EDF3"/>
+          <w:sz w:val="15"/>
+          <w:szCs w:val="15"/>
+        </w:rPr>
+        <w:t xml:space="preserve">* | b6815cb Add Git workflow assignment report with live command evidence</w:t>
+      </w:r>
+    </w:p>
+    <w:p>
+      <w:pPr>
+        <w:shd w:fill="1E1E1E" w:val="clear"/>
+        <w:spacing w:after="0" w:before="0" w:line="230"/>
+      </w:pPr>
+      <w:r>
+        <w:rPr>
+          <w:rFonts w:ascii="Consolas" w:cs="Consolas" w:eastAsia="Consolas" w:hAnsi="Consolas"/>
+          <w:color w:val="E6EDF3"/>
+          <w:sz w:val="15"/>
+          <w:szCs w:val="15"/>
+        </w:rPr>
+        <w:t xml:space="preserve">* |   1c9a84e Merge practice/undo-recovery into main</w:t>
+      </w:r>
+    </w:p>
+    <w:p>
+      <w:pPr>
+        <w:shd w:fill="1E1E1E" w:val="clear"/>
+        <w:spacing w:after="0" w:before="0" w:line="230"/>
+      </w:pPr>
+      <w:r>
+        <w:rPr>
+          <w:rFonts w:ascii="Consolas" w:cs="Consolas" w:eastAsia="Consolas" w:hAnsi="Consolas"/>
+          <w:color w:val="E6EDF3"/>
+          <w:sz w:val="15"/>
+          <w:szCs w:val="15"/>
+        </w:rPr>
+        <w:t xml:space="preserve">|\ \  </w:t>
+      </w:r>
+    </w:p>
+    <w:p>
+      <w:pPr>
+        <w:shd w:fill="1E1E1E" w:val="clear"/>
+        <w:spacing w:after="0" w:before="0" w:line="230"/>
+      </w:pPr>
+      <w:r>
+        <w:rPr>
+          <w:rFonts w:ascii="Consolas" w:cs="Consolas" w:eastAsia="Consolas" w:hAnsi="Consolas"/>
+          <w:color w:val="E6EDF3"/>
+          <w:sz w:val="15"/>
+          <w:szCs w:val="15"/>
+        </w:rPr>
+        <w:t xml:space="preserve">| * | 8300196 (origin/practice/undo-recovery, practice/undo-recovery) Document undo, reflog recovery, and safe revert</w:t>
+      </w:r>
+    </w:p>
+    <w:p>
+      <w:pPr>
+        <w:shd w:fill="1E1E1E" w:val="clear"/>
+        <w:spacing w:after="0" w:before="0" w:line="230"/>
+      </w:pPr>
+      <w:r>
+        <w:rPr>
+          <w:rFonts w:ascii="Consolas" w:cs="Consolas" w:eastAsia="Consolas" w:hAnsi="Consolas"/>
+          <w:color w:val="E6EDF3"/>
+          <w:sz w:val="15"/>
+          <w:szCs w:val="15"/>
+        </w:rPr>
+        <w:t xml:space="preserve">| * | 8712897 Revert "WIP: accidental file added to demonstrate undo"</w:t>
+      </w:r>
+    </w:p>
+    <w:p>
+      <w:pPr>
+        <w:shd w:fill="1E1E1E" w:val="clear"/>
+        <w:spacing w:after="0" w:before="0" w:line="230"/>
+      </w:pPr>
+      <w:r>
+        <w:rPr>
+          <w:rFonts w:ascii="Consolas" w:cs="Consolas" w:eastAsia="Consolas" w:hAnsi="Consolas"/>
+          <w:color w:val="E6EDF3"/>
+          <w:sz w:val="15"/>
+          <w:szCs w:val="15"/>
+        </w:rPr>
+        <w:t xml:space="preserve">| * | 261005b WIP: accidental file added to demonstrate undo</w:t>
+      </w:r>
+    </w:p>
+    <w:p>
+      <w:pPr>
+        <w:shd w:fill="1E1E1E" w:val="clear"/>
+        <w:spacing w:after="0" w:before="0" w:line="230"/>
+      </w:pPr>
+      <w:r>
+        <w:rPr>
+          <w:rFonts w:ascii="Consolas" w:cs="Consolas" w:eastAsia="Consolas" w:hAnsi="Consolas"/>
+          <w:color w:val="E6EDF3"/>
+          <w:sz w:val="15"/>
+          <w:szCs w:val="15"/>
+        </w:rPr>
+        <w:t xml:space="preserve">|/ /  </w:t>
+      </w:r>
+    </w:p>
+    <w:p>
+      <w:pPr>
+        <w:shd w:fill="1E1E1E" w:val="clear"/>
+        <w:spacing w:after="0" w:before="0" w:line="230"/>
+      </w:pPr>
+      <w:r>
+        <w:rPr>
+          <w:rFonts w:ascii="Consolas" w:cs="Consolas" w:eastAsia="Consolas" w:hAnsi="Consolas"/>
+          <w:color w:val="E6EDF3"/>
+          <w:sz w:val="15"/>
+          <w:szCs w:val="15"/>
+        </w:rPr>
+        <w:t xml:space="preserve">* / 67f4658 (fork/main) Fix GitHub Pages black screen by serving the compiled app</w:t>
+      </w:r>
+    </w:p>
+    <w:p>
+      <w:pPr>
+        <w:shd w:fill="1E1E1E" w:val="clear"/>
+        <w:spacing w:after="0" w:before="0" w:line="230"/>
+      </w:pPr>
+      <w:r>
+        <w:rPr>
+          <w:rFonts w:ascii="Consolas" w:cs="Consolas" w:eastAsia="Consolas" w:hAnsi="Consolas"/>
+          <w:color w:val="E6EDF3"/>
+          <w:sz w:val="15"/>
+          <w:szCs w:val="15"/>
         </w:rPr>
         <w:t xml:space="preserve">|/  </w:t>
       </w:r>
@@ -2865,44 +3062,29 @@
     <w:p>
       <w:pPr>
         <w:shd w:fill="1E1E1E" w:val="clear"/>
-        <w:spacing w:after="0" w:before="0" w:line="240"/>
-      </w:pPr>
-      <w:r>
-        <w:rPr>
-          <w:rFonts w:ascii="Consolas" w:cs="Consolas" w:eastAsia="Consolas" w:hAnsi="Consolas"/>
-          <w:color w:val="E6EDF3"/>
-          <w:sz w:val="16"/>
-          <w:szCs w:val="16"/>
-        </w:rPr>
-        <w:t xml:space="preserve">* 67f4658 (fork/main) Fix GitHub Pages black screen by serving the compiled app</w:t>
-      </w:r>
-    </w:p>
-    <w:p>
-      <w:pPr>
-        <w:shd w:fill="1E1E1E" w:val="clear"/>
-        <w:spacing w:after="0" w:before="0" w:line="240"/>
-      </w:pPr>
-      <w:r>
-        <w:rPr>
-          <w:rFonts w:ascii="Consolas" w:cs="Consolas" w:eastAsia="Consolas" w:hAnsi="Consolas"/>
-          <w:color w:val="E6EDF3"/>
-          <w:sz w:val="16"/>
-          <w:szCs w:val="16"/>
-        </w:rPr>
-        <w:t xml:space="preserve">* 0d76397 (tag: v1.0.0, origin/main, origin/HEAD) chore(release): 1.0.0</w:t>
-      </w:r>
-    </w:p>
-    <w:p>
-      <w:pPr>
-        <w:shd w:fill="1E1E1E" w:val="clear"/>
-        <w:spacing w:after="0" w:before="0" w:line="240"/>
-      </w:pPr>
-      <w:r>
-        <w:rPr>
-          <w:rFonts w:ascii="Consolas" w:cs="Consolas" w:eastAsia="Consolas" w:hAnsi="Consolas"/>
-          <w:color w:val="E6EDF3"/>
-          <w:sz w:val="16"/>
-          <w:szCs w:val="16"/>
+        <w:spacing w:after="0" w:before="0" w:line="230"/>
+      </w:pPr>
+      <w:r>
+        <w:rPr>
+          <w:rFonts w:ascii="Consolas" w:cs="Consolas" w:eastAsia="Consolas" w:hAnsi="Consolas"/>
+          <w:color w:val="E6EDF3"/>
+          <w:sz w:val="15"/>
+          <w:szCs w:val="15"/>
+        </w:rPr>
+        <w:t xml:space="preserve">* 0d76397 (tag: v1.0.0) chore(release): 1.0.0</w:t>
+      </w:r>
+    </w:p>
+    <w:p>
+      <w:pPr>
+        <w:shd w:fill="1E1E1E" w:val="clear"/>
+        <w:spacing w:after="0" w:before="0" w:line="230"/>
+      </w:pPr>
+      <w:r>
+        <w:rPr>
+          <w:rFonts w:ascii="Consolas" w:cs="Consolas" w:eastAsia="Consolas" w:hAnsi="Consolas"/>
+          <w:color w:val="E6EDF3"/>
+          <w:sz w:val="15"/>
+          <w:szCs w:val="15"/>
         </w:rPr>
         <w:t xml:space="preserve">* 8ec11f6 Document complete blank page root cause and all fixes</w:t>
       </w:r>
@@ -2910,14 +3092,14 @@
     <w:p>
       <w:pPr>
         <w:shd w:fill="1E1E1E" w:val="clear"/>
-        <w:spacing w:after="0" w:before="0" w:line="240"/>
-      </w:pPr>
-      <w:r>
-        <w:rPr>
-          <w:rFonts w:ascii="Consolas" w:cs="Consolas" w:eastAsia="Consolas" w:hAnsi="Consolas"/>
-          <w:color w:val="E6EDF3"/>
-          <w:sz w:val="16"/>
-          <w:szCs w:val="16"/>
+        <w:spacing w:after="0" w:before="0" w:line="230"/>
+      </w:pPr>
+      <w:r>
+        <w:rPr>
+          <w:rFonts w:ascii="Consolas" w:cs="Consolas" w:eastAsia="Consolas" w:hAnsi="Consolas"/>
+          <w:color w:val="E6EDF3"/>
+          <w:sz w:val="15"/>
+          <w:szCs w:val="15"/>
         </w:rPr>
         <w:t xml:space="preserve">* 9f9c940 Add comprehensive error handling and loading states</w:t>
       </w:r>
@@ -2925,14 +3107,14 @@
     <w:p>
       <w:pPr>
         <w:shd w:fill="1E1E1E" w:val="clear"/>
-        <w:spacing w:after="0" w:before="0" w:line="240"/>
-      </w:pPr>
-      <w:r>
-        <w:rPr>
-          <w:rFonts w:ascii="Consolas" w:cs="Consolas" w:eastAsia="Consolas" w:hAnsi="Consolas"/>
-          <w:color w:val="E6EDF3"/>
-          <w:sz w:val="16"/>
-          <w:szCs w:val="16"/>
+        <w:spacing w:after="0" w:before="0" w:line="230"/>
+      </w:pPr>
+      <w:r>
+        <w:rPr>
+          <w:rFonts w:ascii="Consolas" w:cs="Consolas" w:eastAsia="Consolas" w:hAnsi="Consolas"/>
+          <w:color w:val="E6EDF3"/>
+          <w:sz w:val="15"/>
+          <w:szCs w:val="15"/>
         </w:rPr>
         <w:t xml:space="preserve">* 4d5c673 Critical fix: Allow app to render without Supabase data</w:t>
       </w:r>
@@ -2940,14 +3122,14 @@
     <w:p>
       <w:pPr>
         <w:shd w:fill="1E1E1E" w:val="clear"/>
-        <w:spacing w:after="0" w:before="0" w:line="240"/>
-      </w:pPr>
-      <w:r>
-        <w:rPr>
-          <w:rFonts w:ascii="Consolas" w:cs="Consolas" w:eastAsia="Consolas" w:hAnsi="Consolas"/>
-          <w:color w:val="E6EDF3"/>
-          <w:sz w:val="16"/>
-          <w:szCs w:val="16"/>
+        <w:spacing w:after="0" w:before="0" w:line="230"/>
+      </w:pPr>
+      <w:r>
+        <w:rPr>
+          <w:rFonts w:ascii="Consolas" w:cs="Consolas" w:eastAsia="Consolas" w:hAnsi="Consolas"/>
+          <w:color w:val="E6EDF3"/>
+          <w:sz w:val="15"/>
+          <w:szCs w:val="15"/>
         </w:rPr>
         <w:t xml:space="preserve">* 587ab6c Add blank page fix documentation</w:t>
       </w:r>
@@ -2955,14 +3137,14 @@
     <w:p>
       <w:pPr>
         <w:shd w:fill="1E1E1E" w:val="clear"/>
-        <w:spacing w:after="0" w:before="0" w:line="240"/>
-      </w:pPr>
-      <w:r>
-        <w:rPr>
-          <w:rFonts w:ascii="Consolas" w:cs="Consolas" w:eastAsia="Consolas" w:hAnsi="Consolas"/>
-          <w:color w:val="E6EDF3"/>
-          <w:sz w:val="16"/>
-          <w:szCs w:val="16"/>
+        <w:spacing w:after="0" w:before="0" w:line="230"/>
+      </w:pPr>
+      <w:r>
+        <w:rPr>
+          <w:rFonts w:ascii="Consolas" w:cs="Consolas" w:eastAsia="Consolas" w:hAnsi="Consolas"/>
+          <w:color w:val="E6EDF3"/>
+          <w:sz w:val="15"/>
+          <w:szCs w:val="15"/>
         </w:rPr>
         <w:t xml:space="preserve">* 86e1c71 Fix blank page issue - correct favicon paths and add favicon.svg</w:t>
       </w:r>
@@ -2970,14 +3152,14 @@
     <w:p>
       <w:pPr>
         <w:shd w:fill="1E1E1E" w:val="clear"/>
-        <w:spacing w:after="0" w:before="0" w:line="240"/>
-      </w:pPr>
-      <w:r>
-        <w:rPr>
-          <w:rFonts w:ascii="Consolas" w:cs="Consolas" w:eastAsia="Consolas" w:hAnsi="Consolas"/>
-          <w:color w:val="E6EDF3"/>
-          <w:sz w:val="16"/>
-          <w:szCs w:val="16"/>
+        <w:spacing w:after="0" w:before="0" w:line="230"/>
+      </w:pPr>
+      <w:r>
+        <w:rPr>
+          <w:rFonts w:ascii="Consolas" w:cs="Consolas" w:eastAsia="Consolas" w:hAnsi="Consolas"/>
+          <w:color w:val="E6EDF3"/>
+          <w:sz w:val="15"/>
+          <w:szCs w:val="15"/>
         </w:rPr>
         <w:t xml:space="preserve">* e611ca7 Add GitHub deployment status verification report</w:t>
       </w:r>
@@ -2985,14 +3167,14 @@
     <w:p>
       <w:pPr>
         <w:shd w:fill="1E1E1E" w:val="clear"/>
-        <w:spacing w:after="0" w:before="0" w:line="240"/>
-      </w:pPr>
-      <w:r>
-        <w:rPr>
-          <w:rFonts w:ascii="Consolas" w:cs="Consolas" w:eastAsia="Consolas" w:hAnsi="Consolas"/>
-          <w:color w:val="E6EDF3"/>
-          <w:sz w:val="16"/>
-          <w:szCs w:val="16"/>
+        <w:spacing w:after="0" w:before="0" w:line="230"/>
+      </w:pPr>
+      <w:r>
+        <w:rPr>
+          <w:rFonts w:ascii="Consolas" w:cs="Consolas" w:eastAsia="Consolas" w:hAnsi="Consolas"/>
+          <w:color w:val="E6EDF3"/>
+          <w:sz w:val="15"/>
+          <w:szCs w:val="15"/>
         </w:rPr>
         <w:t xml:space="preserve">* 228edae Fix build and TypeScript errors for GitHub deployment</w:t>
       </w:r>
@@ -3000,14 +3182,14 @@
     <w:p>
       <w:pPr>
         <w:shd w:fill="1E1E1E" w:val="clear"/>
-        <w:spacing w:after="0" w:before="0" w:line="240"/>
-      </w:pPr>
-      <w:r>
-        <w:rPr>
-          <w:rFonts w:ascii="Consolas" w:cs="Consolas" w:eastAsia="Consolas" w:hAnsi="Consolas"/>
-          <w:color w:val="E6EDF3"/>
-          <w:sz w:val="16"/>
-          <w:szCs w:val="16"/>
+        <w:spacing w:after="0" w:before="0" w:line="230"/>
+      </w:pPr>
+      <w:r>
+        <w:rPr>
+          <w:rFonts w:ascii="Consolas" w:cs="Consolas" w:eastAsia="Consolas" w:hAnsi="Consolas"/>
+          <w:color w:val="E6EDF3"/>
+          <w:sz w:val="15"/>
+          <w:szCs w:val="15"/>
         </w:rPr>
         <w:t xml:space="preserve">* f06fa27 Add merge conflict resolution documentation</w:t>
       </w:r>
@@ -3015,14 +3197,14 @@
     <w:p>
       <w:pPr>
         <w:shd w:fill="1E1E1E" w:val="clear"/>
-        <w:spacing w:after="0" w:before="0" w:line="240"/>
-      </w:pPr>
-      <w:r>
-        <w:rPr>
-          <w:rFonts w:ascii="Consolas" w:cs="Consolas" w:eastAsia="Consolas" w:hAnsi="Consolas"/>
-          <w:color w:val="E6EDF3"/>
-          <w:sz w:val="16"/>
-          <w:szCs w:val="16"/>
+        <w:spacing w:after="0" w:before="0" w:line="230"/>
+      </w:pPr>
+      <w:r>
+        <w:rPr>
+          <w:rFonts w:ascii="Consolas" w:cs="Consolas" w:eastAsia="Consolas" w:hAnsi="Consolas"/>
+          <w:color w:val="E6EDF3"/>
+          <w:sz w:val="15"/>
+          <w:szCs w:val="15"/>
         </w:rPr>
         <w:t xml:space="preserve">*   0c4d1bf Resolve merge conflict in README - combine Tech Stack formats</w:t>
       </w:r>
@@ -3030,14 +3212,14 @@
     <w:p>
       <w:pPr>
         <w:shd w:fill="1E1E1E" w:val="clear"/>
-        <w:spacing w:after="0" w:before="0" w:line="240"/>
-      </w:pPr>
-      <w:r>
-        <w:rPr>
-          <w:rFonts w:ascii="Consolas" w:cs="Consolas" w:eastAsia="Consolas" w:hAnsi="Consolas"/>
-          <w:color w:val="E6EDF3"/>
-          <w:sz w:val="16"/>
-          <w:szCs w:val="16"/>
+        <w:spacing w:after="0" w:before="0" w:line="230"/>
+      </w:pPr>
+      <w:r>
+        <w:rPr>
+          <w:rFonts w:ascii="Consolas" w:cs="Consolas" w:eastAsia="Consolas" w:hAnsi="Consolas"/>
+          <w:color w:val="E6EDF3"/>
+          <w:sz w:val="15"/>
+          <w:szCs w:val="15"/>
         </w:rPr>
         <w:t xml:space="preserve">|\  </w:t>
       </w:r>
@@ -3045,14 +3227,14 @@
     <w:p>
       <w:pPr>
         <w:shd w:fill="1E1E1E" w:val="clear"/>
-        <w:spacing w:after="0" w:before="0" w:line="240"/>
-      </w:pPr>
-      <w:r>
-        <w:rPr>
-          <w:rFonts w:ascii="Consolas" w:cs="Consolas" w:eastAsia="Consolas" w:hAnsi="Consolas"/>
-          <w:color w:val="E6EDF3"/>
-          <w:sz w:val="16"/>
-          <w:szCs w:val="16"/>
+        <w:spacing w:after="0" w:before="0" w:line="230"/>
+      </w:pPr>
+      <w:r>
+        <w:rPr>
+          <w:rFonts w:ascii="Consolas" w:cs="Consolas" w:eastAsia="Consolas" w:hAnsi="Consolas"/>
+          <w:color w:val="E6EDF3"/>
+          <w:sz w:val="15"/>
+          <w:szCs w:val="15"/>
         </w:rPr>
         <w:t xml:space="preserve">| * 546fed8 Update Tech Stack section with detailed versions</w:t>
       </w:r>
@@ -3060,14 +3242,14 @@
     <w:p>
       <w:pPr>
         <w:shd w:fill="1E1E1E" w:val="clear"/>
-        <w:spacing w:after="0" w:before="0" w:line="240"/>
-      </w:pPr>
-      <w:r>
-        <w:rPr>
-          <w:rFonts w:ascii="Consolas" w:cs="Consolas" w:eastAsia="Consolas" w:hAnsi="Consolas"/>
-          <w:color w:val="E6EDF3"/>
-          <w:sz w:val="16"/>
-          <w:szCs w:val="16"/>
+        <w:spacing w:after="0" w:before="0" w:line="230"/>
+      </w:pPr>
+      <w:r>
+        <w:rPr>
+          <w:rFonts w:ascii="Consolas" w:cs="Consolas" w:eastAsia="Consolas" w:hAnsi="Consolas"/>
+          <w:color w:val="E6EDF3"/>
+          <w:sz w:val="15"/>
+          <w:szCs w:val="15"/>
         </w:rPr>
         <w:t xml:space="preserve">* | a388209 Add detailed Tech Stack descriptions and Jest testing</w:t>
       </w:r>
@@ -3075,14 +3257,14 @@
     <w:p>
       <w:pPr>
         <w:shd w:fill="1E1E1E" w:val="clear"/>
-        <w:spacing w:after="0" w:before="0" w:line="240"/>
-      </w:pPr>
-      <w:r>
-        <w:rPr>
-          <w:rFonts w:ascii="Consolas" w:cs="Consolas" w:eastAsia="Consolas" w:hAnsi="Consolas"/>
-          <w:color w:val="E6EDF3"/>
-          <w:sz w:val="16"/>
-          <w:szCs w:val="16"/>
+        <w:spacing w:after="0" w:before="0" w:line="230"/>
+      </w:pPr>
+      <w:r>
+        <w:rPr>
+          <w:rFonts w:ascii="Consolas" w:cs="Consolas" w:eastAsia="Consolas" w:hAnsi="Consolas"/>
+          <w:color w:val="E6EDF3"/>
+          <w:sz w:val="15"/>
+          <w:szCs w:val="15"/>
         </w:rPr>
         <w:t xml:space="preserve">|/  </w:t>
       </w:r>
@@ -3090,14 +3272,14 @@
     <w:p>
       <w:pPr>
         <w:shd w:fill="1E1E1E" w:val="clear"/>
-        <w:spacing w:after="0" w:before="0" w:line="240"/>
-      </w:pPr>
-      <w:r>
-        <w:rPr>
-          <w:rFonts w:ascii="Consolas" w:cs="Consolas" w:eastAsia="Consolas" w:hAnsi="Consolas"/>
-          <w:color w:val="E6EDF3"/>
-          <w:sz w:val="16"/>
-          <w:szCs w:val="16"/>
+        <w:spacing w:after="0" w:before="0" w:line="230"/>
+      </w:pPr>
+      <w:r>
+        <w:rPr>
+          <w:rFonts w:ascii="Consolas" w:cs="Consolas" w:eastAsia="Consolas" w:hAnsi="Consolas"/>
+          <w:color w:val="E6EDF3"/>
+          <w:sz w:val="15"/>
+          <w:szCs w:val="15"/>
         </w:rPr>
         <w:t xml:space="preserve">*   946de78 Merge feature/local-hosting into main</w:t>
       </w:r>
@@ -3105,14 +3287,14 @@
     <w:p>
       <w:pPr>
         <w:shd w:fill="1E1E1E" w:val="clear"/>
-        <w:spacing w:after="0" w:before="0" w:line="240"/>
-      </w:pPr>
-      <w:r>
-        <w:rPr>
-          <w:rFonts w:ascii="Consolas" w:cs="Consolas" w:eastAsia="Consolas" w:hAnsi="Consolas"/>
-          <w:color w:val="E6EDF3"/>
-          <w:sz w:val="16"/>
-          <w:szCs w:val="16"/>
+        <w:spacing w:after="0" w:before="0" w:line="230"/>
+      </w:pPr>
+      <w:r>
+        <w:rPr>
+          <w:rFonts w:ascii="Consolas" w:cs="Consolas" w:eastAsia="Consolas" w:hAnsi="Consolas"/>
+          <w:color w:val="E6EDF3"/>
+          <w:sz w:val="15"/>
+          <w:szCs w:val="15"/>
         </w:rPr>
         <w:t xml:space="preserve">|\  </w:t>
       </w:r>
@@ -3120,14 +3302,14 @@
     <w:p>
       <w:pPr>
         <w:shd w:fill="1E1E1E" w:val="clear"/>
-        <w:spacing w:after="0" w:before="0" w:line="240"/>
-      </w:pPr>
-      <w:r>
-        <w:rPr>
-          <w:rFonts w:ascii="Consolas" w:cs="Consolas" w:eastAsia="Consolas" w:hAnsi="Consolas"/>
-          <w:color w:val="E6EDF3"/>
-          <w:sz w:val="16"/>
-          <w:szCs w:val="16"/>
+        <w:spacing w:after="0" w:before="0" w:line="230"/>
+      </w:pPr>
+      <w:r>
+        <w:rPr>
+          <w:rFonts w:ascii="Consolas" w:cs="Consolas" w:eastAsia="Consolas" w:hAnsi="Consolas"/>
+          <w:color w:val="E6EDF3"/>
+          <w:sz w:val="15"/>
+          <w:szCs w:val="15"/>
         </w:rPr>
         <w:t xml:space="preserve">| * a46126a (origin/feature/local-hosting) Add branch-specific notes to README</w:t>
       </w:r>
@@ -3135,14 +3317,14 @@
     <w:p>
       <w:pPr>
         <w:shd w:fill="1E1E1E" w:val="clear"/>
-        <w:spacing w:after="0" w:before="0" w:line="240"/>
-      </w:pPr>
-      <w:r>
-        <w:rPr>
-          <w:rFonts w:ascii="Consolas" w:cs="Consolas" w:eastAsia="Consolas" w:hAnsi="Consolas"/>
-          <w:color w:val="E6EDF3"/>
-          <w:sz w:val="16"/>
-          <w:szCs w:val="16"/>
+        <w:spacing w:after="0" w:before="0" w:line="230"/>
+      </w:pPr>
+      <w:r>
+        <w:rPr>
+          <w:rFonts w:ascii="Consolas" w:cs="Consolas" w:eastAsia="Consolas" w:hAnsi="Consolas"/>
+          <w:color w:val="E6EDF3"/>
+          <w:sz w:val="15"/>
+          <w:szCs w:val="15"/>
         </w:rPr>
         <w:t xml:space="preserve">* |   3b228e5 Merge feature/auth-flow into main</w:t>
       </w:r>
@@ -3150,14 +3332,14 @@
     <w:p>
       <w:pPr>
         <w:shd w:fill="1E1E1E" w:val="clear"/>
-        <w:spacing w:after="0" w:before="0" w:line="240"/>
-      </w:pPr>
-      <w:r>
-        <w:rPr>
-          <w:rFonts w:ascii="Consolas" w:cs="Consolas" w:eastAsia="Consolas" w:hAnsi="Consolas"/>
-          <w:color w:val="E6EDF3"/>
-          <w:sz w:val="16"/>
-          <w:szCs w:val="16"/>
+        <w:spacing w:after="0" w:before="0" w:line="230"/>
+      </w:pPr>
+      <w:r>
+        <w:rPr>
+          <w:rFonts w:ascii="Consolas" w:cs="Consolas" w:eastAsia="Consolas" w:hAnsi="Consolas"/>
+          <w:color w:val="E6EDF3"/>
+          <w:sz w:val="15"/>
+          <w:szCs w:val="15"/>
         </w:rPr>
         <w:t xml:space="preserve">|\ \  </w:t>
       </w:r>
@@ -3165,14 +3347,14 @@
     <w:p>
       <w:pPr>
         <w:shd w:fill="1E1E1E" w:val="clear"/>
-        <w:spacing w:after="0" w:before="0" w:line="240"/>
-      </w:pPr>
-      <w:r>
-        <w:rPr>
-          <w:rFonts w:ascii="Consolas" w:cs="Consolas" w:eastAsia="Consolas" w:hAnsi="Consolas"/>
-          <w:color w:val="E6EDF3"/>
-          <w:sz w:val="16"/>
-          <w:szCs w:val="16"/>
+        <w:spacing w:after="0" w:before="0" w:line="230"/>
+      </w:pPr>
+      <w:r>
+        <w:rPr>
+          <w:rFonts w:ascii="Consolas" w:cs="Consolas" w:eastAsia="Consolas" w:hAnsi="Consolas"/>
+          <w:color w:val="E6EDF3"/>
+          <w:sz w:val="15"/>
+          <w:szCs w:val="15"/>
         </w:rPr>
         <w:t xml:space="preserve">| * | 727f70c (origin/feature/auth-flow) Add branch-specific notes to README</w:t>
       </w:r>
@@ -3180,14 +3362,14 @@
     <w:p>
       <w:pPr>
         <w:shd w:fill="1E1E1E" w:val="clear"/>
-        <w:spacing w:after="0" w:before="0" w:line="240"/>
-      </w:pPr>
-      <w:r>
-        <w:rPr>
-          <w:rFonts w:ascii="Consolas" w:cs="Consolas" w:eastAsia="Consolas" w:hAnsi="Consolas"/>
-          <w:color w:val="E6EDF3"/>
-          <w:sz w:val="16"/>
-          <w:szCs w:val="16"/>
+        <w:spacing w:after="0" w:before="0" w:line="230"/>
+      </w:pPr>
+      <w:r>
+        <w:rPr>
+          <w:rFonts w:ascii="Consolas" w:cs="Consolas" w:eastAsia="Consolas" w:hAnsi="Consolas"/>
+          <w:color w:val="E6EDF3"/>
+          <w:sz w:val="15"/>
+          <w:szCs w:val="15"/>
         </w:rPr>
         <w:t xml:space="preserve">| |/  </w:t>
       </w:r>
@@ -3195,14 +3377,14 @@
     <w:p>
       <w:pPr>
         <w:shd w:fill="1E1E1E" w:val="clear"/>
-        <w:spacing w:after="0" w:before="0" w:line="240"/>
-      </w:pPr>
-      <w:r>
-        <w:rPr>
-          <w:rFonts w:ascii="Consolas" w:cs="Consolas" w:eastAsia="Consolas" w:hAnsi="Consolas"/>
-          <w:color w:val="E6EDF3"/>
-          <w:sz w:val="16"/>
-          <w:szCs w:val="16"/>
+        <w:spacing w:after="0" w:before="0" w:line="230"/>
+      </w:pPr>
+      <w:r>
+        <w:rPr>
+          <w:rFonts w:ascii="Consolas" w:cs="Consolas" w:eastAsia="Consolas" w:hAnsi="Consolas"/>
+          <w:color w:val="E6EDF3"/>
+          <w:sz w:val="15"/>
+          <w:szCs w:val="15"/>
         </w:rPr>
         <w:t xml:space="preserve">* |   d102f7b Merge feature/homepage-ui into main</w:t>
       </w:r>
@@ -3210,14 +3392,14 @@
     <w:p>
       <w:pPr>
         <w:shd w:fill="1E1E1E" w:val="clear"/>
-        <w:spacing w:after="0" w:before="0" w:line="240"/>
-      </w:pPr>
-      <w:r>
-        <w:rPr>
-          <w:rFonts w:ascii="Consolas" w:cs="Consolas" w:eastAsia="Consolas" w:hAnsi="Consolas"/>
-          <w:color w:val="E6EDF3"/>
-          <w:sz w:val="16"/>
-          <w:szCs w:val="16"/>
+        <w:spacing w:after="0" w:before="0" w:line="230"/>
+      </w:pPr>
+      <w:r>
+        <w:rPr>
+          <w:rFonts w:ascii="Consolas" w:cs="Consolas" w:eastAsia="Consolas" w:hAnsi="Consolas"/>
+          <w:color w:val="E6EDF3"/>
+          <w:sz w:val="15"/>
+          <w:szCs w:val="15"/>
         </w:rPr>
         <w:t xml:space="preserve">|\ \  </w:t>
       </w:r>
@@ -3225,14 +3407,14 @@
     <w:p>
       <w:pPr>
         <w:shd w:fill="1E1E1E" w:val="clear"/>
-        <w:spacing w:after="0" w:before="0" w:line="240"/>
-      </w:pPr>
-      <w:r>
-        <w:rPr>
-          <w:rFonts w:ascii="Consolas" w:cs="Consolas" w:eastAsia="Consolas" w:hAnsi="Consolas"/>
-          <w:color w:val="E6EDF3"/>
-          <w:sz w:val="16"/>
-          <w:szCs w:val="16"/>
+        <w:spacing w:after="0" w:before="0" w:line="230"/>
+      </w:pPr>
+      <w:r>
+        <w:rPr>
+          <w:rFonts w:ascii="Consolas" w:cs="Consolas" w:eastAsia="Consolas" w:hAnsi="Consolas"/>
+          <w:color w:val="E6EDF3"/>
+          <w:sz w:val="15"/>
+          <w:szCs w:val="15"/>
         </w:rPr>
         <w:t xml:space="preserve">| * | d4e0860 (origin/feature/homepage-ui) Add branch-specific notes to README</w:t>
       </w:r>
@@ -3240,14 +3422,14 @@
     <w:p>
       <w:pPr>
         <w:shd w:fill="1E1E1E" w:val="clear"/>
-        <w:spacing w:after="0" w:before="0" w:line="240"/>
-      </w:pPr>
-      <w:r>
-        <w:rPr>
-          <w:rFonts w:ascii="Consolas" w:cs="Consolas" w:eastAsia="Consolas" w:hAnsi="Consolas"/>
-          <w:color w:val="E6EDF3"/>
-          <w:sz w:val="16"/>
-          <w:szCs w:val="16"/>
+        <w:spacing w:after="0" w:before="0" w:line="230"/>
+      </w:pPr>
+      <w:r>
+        <w:rPr>
+          <w:rFonts w:ascii="Consolas" w:cs="Consolas" w:eastAsia="Consolas" w:hAnsi="Consolas"/>
+          <w:color w:val="E6EDF3"/>
+          <w:sz w:val="15"/>
+          <w:szCs w:val="15"/>
         </w:rPr>
         <w:t xml:space="preserve">* | | 8f7afbb Update .gitignore and CHANGELOG.md with comprehensive details</w:t>
       </w:r>
@@ -3255,14 +3437,14 @@
     <w:p>
       <w:pPr>
         <w:shd w:fill="1E1E1E" w:val="clear"/>
-        <w:spacing w:after="0" w:before="0" w:line="240"/>
-      </w:pPr>
-      <w:r>
-        <w:rPr>
-          <w:rFonts w:ascii="Consolas" w:cs="Consolas" w:eastAsia="Consolas" w:hAnsi="Consolas"/>
-          <w:color w:val="E6EDF3"/>
-          <w:sz w:val="16"/>
-          <w:szCs w:val="16"/>
+        <w:spacing w:after="0" w:before="0" w:line="230"/>
+      </w:pPr>
+      <w:r>
+        <w:rPr>
+          <w:rFonts w:ascii="Consolas" w:cs="Consolas" w:eastAsia="Consolas" w:hAnsi="Consolas"/>
+          <w:color w:val="E6EDF3"/>
+          <w:sz w:val="15"/>
+          <w:szCs w:val="15"/>
         </w:rPr>
         <w:t xml:space="preserve">* | | c40245f Update README.md with comprehensive project documentation</w:t>
       </w:r>
@@ -3270,14 +3452,14 @@
     <w:p>
       <w:pPr>
         <w:shd w:fill="1E1E1E" w:val="clear"/>
-        <w:spacing w:after="0" w:before="0" w:line="240"/>
-      </w:pPr>
-      <w:r>
-        <w:rPr>
-          <w:rFonts w:ascii="Consolas" w:cs="Consolas" w:eastAsia="Consolas" w:hAnsi="Consolas"/>
-          <w:color w:val="E6EDF3"/>
-          <w:sz w:val="16"/>
-          <w:szCs w:val="16"/>
+        <w:spacing w:after="0" w:before="0" w:line="230"/>
+      </w:pPr>
+      <w:r>
+        <w:rPr>
+          <w:rFonts w:ascii="Consolas" w:cs="Consolas" w:eastAsia="Consolas" w:hAnsi="Consolas"/>
+          <w:color w:val="E6EDF3"/>
+          <w:sz w:val="15"/>
+          <w:szCs w:val="15"/>
         </w:rPr>
         <w:t xml:space="preserve">|/ /  </w:t>
       </w:r>
@@ -3285,14 +3467,14 @@
     <w:p>
       <w:pPr>
         <w:shd w:fill="1E1E1E" w:val="clear"/>
-        <w:spacing w:after="0" w:before="0" w:line="240"/>
-      </w:pPr>
-      <w:r>
-        <w:rPr>
-          <w:rFonts w:ascii="Consolas" w:cs="Consolas" w:eastAsia="Consolas" w:hAnsi="Consolas"/>
-          <w:color w:val="E6EDF3"/>
-          <w:sz w:val="16"/>
-          <w:szCs w:val="16"/>
+        <w:spacing w:after="0" w:before="0" w:line="230"/>
+      </w:pPr>
+      <w:r>
+        <w:rPr>
+          <w:rFonts w:ascii="Consolas" w:cs="Consolas" w:eastAsia="Consolas" w:hAnsi="Consolas"/>
+          <w:color w:val="E6EDF3"/>
+          <w:sz w:val="15"/>
+          <w:szCs w:val="15"/>
         </w:rPr>
         <w:t xml:space="preserve">* / d39aed6 new branches uploaded</w:t>
       </w:r>
@@ -3300,14 +3482,14 @@
     <w:p>
       <w:pPr>
         <w:shd w:fill="1E1E1E" w:val="clear"/>
-        <w:spacing w:after="0" w:before="0" w:line="240"/>
-      </w:pPr>
-      <w:r>
-        <w:rPr>
-          <w:rFonts w:ascii="Consolas" w:cs="Consolas" w:eastAsia="Consolas" w:hAnsi="Consolas"/>
-          <w:color w:val="E6EDF3"/>
-          <w:sz w:val="16"/>
-          <w:szCs w:val="16"/>
+        <w:spacing w:after="0" w:before="0" w:line="230"/>
+      </w:pPr>
+      <w:r>
+        <w:rPr>
+          <w:rFonts w:ascii="Consolas" w:cs="Consolas" w:eastAsia="Consolas" w:hAnsi="Consolas"/>
+          <w:color w:val="E6EDF3"/>
+          <w:sz w:val="15"/>
+          <w:szCs w:val="15"/>
         </w:rPr>
         <w:t xml:space="preserve">|/  </w:t>
       </w:r>
@@ -3315,14 +3497,14 @@
     <w:p>
       <w:pPr>
         <w:shd w:fill="1E1E1E" w:val="clear"/>
-        <w:spacing w:after="0" w:before="0" w:line="240"/>
-      </w:pPr>
-      <w:r>
-        <w:rPr>
-          <w:rFonts w:ascii="Consolas" w:cs="Consolas" w:eastAsia="Consolas" w:hAnsi="Consolas"/>
-          <w:color w:val="E6EDF3"/>
-          <w:sz w:val="16"/>
-          <w:szCs w:val="16"/>
+        <w:spacing w:after="0" w:before="0" w:line="230"/>
+      </w:pPr>
+      <w:r>
+        <w:rPr>
+          <w:rFonts w:ascii="Consolas" w:cs="Consolas" w:eastAsia="Consolas" w:hAnsi="Consolas"/>
+          <w:color w:val="E6EDF3"/>
+          <w:sz w:val="15"/>
+          <w:szCs w:val="15"/>
         </w:rPr>
         <w:t xml:space="preserve">* ce123e6 Fix GitHub Pages deployment workflow</w:t>
       </w:r>
@@ -3330,21 +3512,21 @@
     <w:p>
       <w:pPr>
         <w:shd w:fill="1E1E1E" w:val="clear"/>
-        <w:spacing w:after="160" w:before="0" w:line="240"/>
-      </w:pPr>
-      <w:r>
-        <w:rPr>
-          <w:rFonts w:ascii="Consolas" w:cs="Consolas" w:eastAsia="Consolas" w:hAnsi="Consolas"/>
-          <w:color w:val="E6EDF3"/>
-          <w:sz w:val="16"/>
-          <w:szCs w:val="16"/>
+        <w:spacing w:after="160" w:before="0" w:line="230"/>
+      </w:pPr>
+      <w:r>
+        <w:rPr>
+          <w:rFonts w:ascii="Consolas" w:cs="Consolas" w:eastAsia="Consolas" w:hAnsi="Consolas"/>
+          <w:color w:val="E6EDF3"/>
+          <w:sz w:val="15"/>
+          <w:szCs w:val="15"/>
         </w:rPr>
         <w:t xml:space="preserve">* fe8616e Initial commit for GitHub Pages deployment</w:t>
       </w:r>
     </w:p>
     <w:p>
       <w:pPr>
-        <w:spacing w:after="80" w:before="120"/>
+        <w:spacing w:after="60" w:before="80"/>
       </w:pPr>
       <w:r>
         <w:rPr>
@@ -3353,7 +3535,7 @@
           <w:bCs/>
           <w:i/>
           <w:iCs/>
-          <w:color w:val="555555"/>
+          <w:color w:val="4A4A4A"/>
           <w:sz w:val="20"/>
           <w:szCs w:val="20"/>
         </w:rPr>
@@ -3362,15 +3544,15 @@
     </w:p>
     <w:p>
       <w:pPr>
-        <w:spacing w:after="80"/>
+        <w:spacing w:after="40"/>
         <w:jc w:val="center"/>
       </w:pPr>
       <w:r>
         <w:drawing>
           <wp:inline distT="0" distB="0" distL="0" distR="0">
-            <wp:extent cx="5905500" cy="5143500"/>
+            <wp:extent cx="5905500" cy="5972175"/>
             <wp:effectExtent t="0" r="0" b="0" l="0"/>
-            <wp:docPr id="1" name="Figure 1. git log --oneline --graph --decorate --all" descr="Full decorated commit graph of software_project including feature merges, the README conflict, tag v1.0.0, and undo recovery." title="Figure 1. git log --oneline --graph --decorate --all"/>
+            <wp:docPr id="1" name="Figure 1. git log --oneline --graph --decorate --all" descr="Decorated commit graph of sayem4/software_project including feature merges, README conflict, tag v1.0.0, and undo recovery." title="Figure 1. git log --oneline --graph --decorate --all"/>
             <wp:cNvGraphicFramePr>
               <a:graphicFrameLocks xmlns:a="http://schemas.openxmlformats.org/drawingml/2006/main" noChangeAspect="1"/>
             </wp:cNvGraphicFramePr>
@@ -3393,7 +3575,7 @@
                   <pic:spPr bwMode="auto">
                     <a:xfrm>
                       <a:off x="0" y="0"/>
-                      <a:ext cx="5905500" cy="5143500"/>
+                      <a:ext cx="5905500" cy="5972175"/>
                     </a:xfrm>
                     <a:prstGeom prst="rect">
                       <a:avLst/>
@@ -3408,7 +3590,7 @@
     </w:p>
     <w:p>
       <w:pPr>
-        <w:spacing w:after="200" w:before="0" w:line="276"/>
+        <w:spacing w:after="180" w:before="0" w:line="276"/>
         <w:jc w:val="center"/>
       </w:pPr>
       <w:r>
@@ -3418,17 +3600,17 @@
           <w:bCs w:val="false"/>
           <w:i/>
           <w:iCs/>
-          <w:color w:val="555555"/>
+          <w:color w:val="4A4A4A"/>
           <w:sz w:val="18"/>
           <w:szCs w:val="18"/>
         </w:rPr>
-        <w:t xml:space="preserve">Figure. Live output captured from the project working tree.</w:t>
+        <w:t xml:space="preserve">Captured from the live working tree of sayem4/software_project.</w:t>
       </w:r>
     </w:p>
     <w:p>
       <w:pPr>
         <w:pStyle w:val="Heading2"/>
-        <w:spacing w:after="140" w:before="240"/>
+        <w:spacing w:after="120" w:before="220"/>
       </w:pPr>
       <w:r>
         <w:rPr>
@@ -3445,14 +3627,14 @@
     <w:p>
       <w:pPr>
         <w:shd w:fill="1E1E1E" w:val="clear"/>
-        <w:spacing w:after="0" w:before="80" w:line="240"/>
-      </w:pPr>
-      <w:r>
-        <w:rPr>
-          <w:rFonts w:ascii="Consolas" w:cs="Consolas" w:eastAsia="Consolas" w:hAnsi="Consolas"/>
-          <w:color w:val="E6EDF3"/>
-          <w:sz w:val="16"/>
-          <w:szCs w:val="16"/>
+        <w:spacing w:after="0" w:before="80" w:line="230"/>
+      </w:pPr>
+      <w:r>
+        <w:rPr>
+          <w:rFonts w:ascii="Consolas" w:cs="Consolas" w:eastAsia="Consolas" w:hAnsi="Consolas"/>
+          <w:color w:val="E6EDF3"/>
+          <w:sz w:val="15"/>
+          <w:szCs w:val="15"/>
         </w:rPr>
         <w:t xml:space="preserve">* main</w:t>
       </w:r>
@@ -3460,14 +3642,14 @@
     <w:p>
       <w:pPr>
         <w:shd w:fill="1E1E1E" w:val="clear"/>
-        <w:spacing w:after="0" w:before="0" w:line="240"/>
-      </w:pPr>
-      <w:r>
-        <w:rPr>
-          <w:rFonts w:ascii="Consolas" w:cs="Consolas" w:eastAsia="Consolas" w:hAnsi="Consolas"/>
-          <w:color w:val="E6EDF3"/>
-          <w:sz w:val="16"/>
-          <w:szCs w:val="16"/>
+        <w:spacing w:after="0" w:before="0" w:line="230"/>
+      </w:pPr>
+      <w:r>
+        <w:rPr>
+          <w:rFonts w:ascii="Consolas" w:cs="Consolas" w:eastAsia="Consolas" w:hAnsi="Consolas"/>
+          <w:color w:val="E6EDF3"/>
+          <w:sz w:val="15"/>
+          <w:szCs w:val="15"/>
         </w:rPr>
         <w:t xml:space="preserve">  practice/undo-recovery</w:t>
       </w:r>
@@ -3475,14 +3657,14 @@
     <w:p>
       <w:pPr>
         <w:shd w:fill="1E1E1E" w:val="clear"/>
-        <w:spacing w:after="0" w:before="0" w:line="240"/>
-      </w:pPr>
-      <w:r>
-        <w:rPr>
-          <w:rFonts w:ascii="Consolas" w:cs="Consolas" w:eastAsia="Consolas" w:hAnsi="Consolas"/>
-          <w:color w:val="E6EDF3"/>
-          <w:sz w:val="16"/>
-          <w:szCs w:val="16"/>
+        <w:spacing w:after="0" w:before="0" w:line="230"/>
+      </w:pPr>
+      <w:r>
+        <w:rPr>
+          <w:rFonts w:ascii="Consolas" w:cs="Consolas" w:eastAsia="Consolas" w:hAnsi="Consolas"/>
+          <w:color w:val="E6EDF3"/>
+          <w:sz w:val="15"/>
+          <w:szCs w:val="15"/>
         </w:rPr>
         <w:t xml:space="preserve">  remotes/fork/main</w:t>
       </w:r>
@@ -3490,14 +3672,14 @@
     <w:p>
       <w:pPr>
         <w:shd w:fill="1E1E1E" w:val="clear"/>
-        <w:spacing w:after="0" w:before="0" w:line="240"/>
-      </w:pPr>
-      <w:r>
-        <w:rPr>
-          <w:rFonts w:ascii="Consolas" w:cs="Consolas" w:eastAsia="Consolas" w:hAnsi="Consolas"/>
-          <w:color w:val="E6EDF3"/>
-          <w:sz w:val="16"/>
-          <w:szCs w:val="16"/>
+        <w:spacing w:after="0" w:before="0" w:line="230"/>
+      </w:pPr>
+      <w:r>
+        <w:rPr>
+          <w:rFonts w:ascii="Consolas" w:cs="Consolas" w:eastAsia="Consolas" w:hAnsi="Consolas"/>
+          <w:color w:val="E6EDF3"/>
+          <w:sz w:val="15"/>
+          <w:szCs w:val="15"/>
         </w:rPr>
         <w:t xml:space="preserve">  remotes/origin/HEAD -&gt; origin/main</w:t>
       </w:r>
@@ -3505,14 +3687,14 @@
     <w:p>
       <w:pPr>
         <w:shd w:fill="1E1E1E" w:val="clear"/>
-        <w:spacing w:after="0" w:before="0" w:line="240"/>
-      </w:pPr>
-      <w:r>
-        <w:rPr>
-          <w:rFonts w:ascii="Consolas" w:cs="Consolas" w:eastAsia="Consolas" w:hAnsi="Consolas"/>
-          <w:color w:val="E6EDF3"/>
-          <w:sz w:val="16"/>
-          <w:szCs w:val="16"/>
+        <w:spacing w:after="0" w:before="0" w:line="230"/>
+      </w:pPr>
+      <w:r>
+        <w:rPr>
+          <w:rFonts w:ascii="Consolas" w:cs="Consolas" w:eastAsia="Consolas" w:hAnsi="Consolas"/>
+          <w:color w:val="E6EDF3"/>
+          <w:sz w:val="15"/>
+          <w:szCs w:val="15"/>
         </w:rPr>
         <w:t xml:space="preserve">  remotes/origin/feature/auth-flow</w:t>
       </w:r>
@@ -3520,14 +3702,14 @@
     <w:p>
       <w:pPr>
         <w:shd w:fill="1E1E1E" w:val="clear"/>
-        <w:spacing w:after="0" w:before="0" w:line="240"/>
-      </w:pPr>
-      <w:r>
-        <w:rPr>
-          <w:rFonts w:ascii="Consolas" w:cs="Consolas" w:eastAsia="Consolas" w:hAnsi="Consolas"/>
-          <w:color w:val="E6EDF3"/>
-          <w:sz w:val="16"/>
-          <w:szCs w:val="16"/>
+        <w:spacing w:after="0" w:before="0" w:line="230"/>
+      </w:pPr>
+      <w:r>
+        <w:rPr>
+          <w:rFonts w:ascii="Consolas" w:cs="Consolas" w:eastAsia="Consolas" w:hAnsi="Consolas"/>
+          <w:color w:val="E6EDF3"/>
+          <w:sz w:val="15"/>
+          <w:szCs w:val="15"/>
         </w:rPr>
         <w:t xml:space="preserve">  remotes/origin/feature/homepage-ui</w:t>
       </w:r>
@@ -3535,14 +3717,14 @@
     <w:p>
       <w:pPr>
         <w:shd w:fill="1E1E1E" w:val="clear"/>
-        <w:spacing w:after="0" w:before="0" w:line="240"/>
-      </w:pPr>
-      <w:r>
-        <w:rPr>
-          <w:rFonts w:ascii="Consolas" w:cs="Consolas" w:eastAsia="Consolas" w:hAnsi="Consolas"/>
-          <w:color w:val="E6EDF3"/>
-          <w:sz w:val="16"/>
-          <w:szCs w:val="16"/>
+        <w:spacing w:after="0" w:before="0" w:line="230"/>
+      </w:pPr>
+      <w:r>
+        <w:rPr>
+          <w:rFonts w:ascii="Consolas" w:cs="Consolas" w:eastAsia="Consolas" w:hAnsi="Consolas"/>
+          <w:color w:val="E6EDF3"/>
+          <w:sz w:val="15"/>
+          <w:szCs w:val="15"/>
         </w:rPr>
         <w:t xml:space="preserve">  remotes/origin/feature/local-hosting</w:t>
       </w:r>
@@ -3550,21 +3732,36 @@
     <w:p>
       <w:pPr>
         <w:shd w:fill="1E1E1E" w:val="clear"/>
-        <w:spacing w:after="160" w:before="0" w:line="240"/>
-      </w:pPr>
-      <w:r>
-        <w:rPr>
-          <w:rFonts w:ascii="Consolas" w:cs="Consolas" w:eastAsia="Consolas" w:hAnsi="Consolas"/>
-          <w:color w:val="E6EDF3"/>
-          <w:sz w:val="16"/>
-          <w:szCs w:val="16"/>
+        <w:spacing w:after="0" w:before="0" w:line="230"/>
+      </w:pPr>
+      <w:r>
+        <w:rPr>
+          <w:rFonts w:ascii="Consolas" w:cs="Consolas" w:eastAsia="Consolas" w:hAnsi="Consolas"/>
+          <w:color w:val="E6EDF3"/>
+          <w:sz w:val="15"/>
+          <w:szCs w:val="15"/>
         </w:rPr>
         <w:t xml:space="preserve">  remotes/origin/main</w:t>
       </w:r>
     </w:p>
     <w:p>
       <w:pPr>
-        <w:spacing w:after="80" w:before="120"/>
+        <w:shd w:fill="1E1E1E" w:val="clear"/>
+        <w:spacing w:after="160" w:before="0" w:line="230"/>
+      </w:pPr>
+      <w:r>
+        <w:rPr>
+          <w:rFonts w:ascii="Consolas" w:cs="Consolas" w:eastAsia="Consolas" w:hAnsi="Consolas"/>
+          <w:color w:val="E6EDF3"/>
+          <w:sz w:val="15"/>
+          <w:szCs w:val="15"/>
+        </w:rPr>
+        <w:t xml:space="preserve">  remotes/origin/practice/undo-recovery</w:t>
+      </w:r>
+    </w:p>
+    <w:p>
+      <w:pPr>
+        <w:spacing w:after="60" w:before="80"/>
       </w:pPr>
       <w:r>
         <w:rPr>
@@ -3573,7 +3770,7 @@
           <w:bCs/>
           <w:i/>
           <w:iCs/>
-          <w:color w:val="555555"/>
+          <w:color w:val="4A4A4A"/>
           <w:sz w:val="20"/>
           <w:szCs w:val="20"/>
         </w:rPr>
@@ -3582,13 +3779,13 @@
     </w:p>
     <w:p>
       <w:pPr>
-        <w:spacing w:after="80"/>
+        <w:spacing w:after="40"/>
         <w:jc w:val="center"/>
       </w:pPr>
       <w:r>
         <w:drawing>
           <wp:inline distT="0" distB="0" distL="0" distR="0">
-            <wp:extent cx="5905500" cy="1600200"/>
+            <wp:extent cx="5905500" cy="1714500"/>
             <wp:effectExtent t="0" r="0" b="0" l="0"/>
             <wp:docPr id="1" name="Figure 2. git branch -a" descr="Local and remote branches including the three feature branches and practice/undo-recovery." title="Figure 2. git branch -a"/>
             <wp:cNvGraphicFramePr>
@@ -3613,7 +3810,7 @@
                   <pic:spPr bwMode="auto">
                     <a:xfrm>
                       <a:off x="0" y="0"/>
-                      <a:ext cx="5905500" cy="1600200"/>
+                      <a:ext cx="5905500" cy="1714500"/>
                     </a:xfrm>
                     <a:prstGeom prst="rect">
                       <a:avLst/>
@@ -3628,7 +3825,7 @@
     </w:p>
     <w:p>
       <w:pPr>
-        <w:spacing w:after="200" w:before="0" w:line="276"/>
+        <w:spacing w:after="180" w:before="0" w:line="276"/>
         <w:jc w:val="center"/>
       </w:pPr>
       <w:r>
@@ -3638,17 +3835,17 @@
           <w:bCs w:val="false"/>
           <w:i/>
           <w:iCs/>
-          <w:color w:val="555555"/>
+          <w:color w:val="4A4A4A"/>
           <w:sz w:val="18"/>
           <w:szCs w:val="18"/>
         </w:rPr>
-        <w:t xml:space="preserve">Figure. Live output captured from the project working tree.</w:t>
+        <w:t xml:space="preserve">Captured from the live working tree of sayem4/software_project.</w:t>
       </w:r>
     </w:p>
     <w:p>
       <w:pPr>
         <w:pStyle w:val="Heading2"/>
-        <w:spacing w:after="140" w:before="240"/>
+        <w:spacing w:after="120" w:before="220"/>
       </w:pPr>
       <w:r>
         <w:rPr>
@@ -3665,21 +3862,21 @@
     <w:p>
       <w:pPr>
         <w:shd w:fill="1E1E1E" w:val="clear"/>
-        <w:spacing w:after="160" w:before="80" w:line="240"/>
-      </w:pPr>
-      <w:r>
-        <w:rPr>
-          <w:rFonts w:ascii="Consolas" w:cs="Consolas" w:eastAsia="Consolas" w:hAnsi="Consolas"/>
-          <w:color w:val="E6EDF3"/>
-          <w:sz w:val="16"/>
-          <w:szCs w:val="16"/>
+        <w:spacing w:after="160" w:before="80" w:line="230"/>
+      </w:pPr>
+      <w:r>
+        <w:rPr>
+          <w:rFonts w:ascii="Consolas" w:cs="Consolas" w:eastAsia="Consolas" w:hAnsi="Consolas"/>
+          <w:color w:val="E6EDF3"/>
+          <w:sz w:val="15"/>
+          <w:szCs w:val="15"/>
         </w:rPr>
         <w:t xml:space="preserve">v1.0.0          chore(release): 1.0.0</w:t>
       </w:r>
     </w:p>
     <w:p>
       <w:pPr>
-        <w:spacing w:after="80" w:before="120"/>
+        <w:spacing w:after="60" w:before="80"/>
       </w:pPr>
       <w:r>
         <w:rPr>
@@ -3688,7 +3885,7 @@
           <w:bCs/>
           <w:i/>
           <w:iCs/>
-          <w:color w:val="555555"/>
+          <w:color w:val="4A4A4A"/>
           <w:sz w:val="20"/>
           <w:szCs w:val="20"/>
         </w:rPr>
@@ -3697,7 +3894,7 @@
     </w:p>
     <w:p>
       <w:pPr>
-        <w:spacing w:after="80"/>
+        <w:spacing w:after="40"/>
         <w:jc w:val="center"/>
       </w:pPr>
       <w:r>
@@ -3743,7 +3940,7 @@
     </w:p>
     <w:p>
       <w:pPr>
-        <w:spacing w:after="200" w:before="0" w:line="276"/>
+        <w:spacing w:after="180" w:before="0" w:line="276"/>
         <w:jc w:val="center"/>
       </w:pPr>
       <w:r>
@@ -3753,17 +3950,17 @@
           <w:bCs w:val="false"/>
           <w:i/>
           <w:iCs/>
-          <w:color w:val="555555"/>
+          <w:color w:val="4A4A4A"/>
           <w:sz w:val="18"/>
           <w:szCs w:val="18"/>
         </w:rPr>
-        <w:t xml:space="preserve">Figure. Live output captured from the project working tree.</w:t>
+        <w:t xml:space="preserve">Captured from the live working tree of sayem4/software_project.</w:t>
       </w:r>
     </w:p>
     <w:p>
       <w:pPr>
         <w:pStyle w:val="Heading2"/>
-        <w:spacing w:after="140" w:before="240"/>
+        <w:spacing w:after="120" w:before="220"/>
       </w:pPr>
       <w:r>
         <w:rPr>
@@ -3780,156 +3977,186 @@
     <w:p>
       <w:pPr>
         <w:shd w:fill="1E1E1E" w:val="clear"/>
-        <w:spacing w:after="0" w:before="80" w:line="240"/>
-      </w:pPr>
-      <w:r>
-        <w:rPr>
-          <w:rFonts w:ascii="Consolas" w:cs="Consolas" w:eastAsia="Consolas" w:hAnsi="Consolas"/>
-          <w:color w:val="E6EDF3"/>
-          <w:sz w:val="16"/>
-          <w:szCs w:val="16"/>
-        </w:rPr>
-        <w:t xml:space="preserve">1c9a84e HEAD@{0}: merge practice/undo-recovery: Merge made by the 'ort' strategy.</w:t>
-      </w:r>
-    </w:p>
-    <w:p>
-      <w:pPr>
-        <w:shd w:fill="1E1E1E" w:val="clear"/>
-        <w:spacing w:after="0" w:before="0" w:line="240"/>
-      </w:pPr>
-      <w:r>
-        <w:rPr>
-          <w:rFonts w:ascii="Consolas" w:cs="Consolas" w:eastAsia="Consolas" w:hAnsi="Consolas"/>
-          <w:color w:val="E6EDF3"/>
-          <w:sz w:val="16"/>
-          <w:szCs w:val="16"/>
-        </w:rPr>
-        <w:t xml:space="preserve">67f4658 HEAD@{1}: checkout: moving from practice/undo-recovery to main</w:t>
-      </w:r>
-    </w:p>
-    <w:p>
-      <w:pPr>
-        <w:shd w:fill="1E1E1E" w:val="clear"/>
-        <w:spacing w:after="0" w:before="0" w:line="240"/>
-      </w:pPr>
-      <w:r>
-        <w:rPr>
-          <w:rFonts w:ascii="Consolas" w:cs="Consolas" w:eastAsia="Consolas" w:hAnsi="Consolas"/>
-          <w:color w:val="E6EDF3"/>
-          <w:sz w:val="16"/>
-          <w:szCs w:val="16"/>
-        </w:rPr>
-        <w:t xml:space="preserve">8300196 HEAD@{2}: commit: Document undo, reflog recovery, and safe revert</w:t>
-      </w:r>
-    </w:p>
-    <w:p>
-      <w:pPr>
-        <w:shd w:fill="1E1E1E" w:val="clear"/>
-        <w:spacing w:after="0" w:before="0" w:line="240"/>
-      </w:pPr>
-      <w:r>
-        <w:rPr>
-          <w:rFonts w:ascii="Consolas" w:cs="Consolas" w:eastAsia="Consolas" w:hAnsi="Consolas"/>
-          <w:color w:val="E6EDF3"/>
-          <w:sz w:val="16"/>
-          <w:szCs w:val="16"/>
-        </w:rPr>
-        <w:t xml:space="preserve">8712897 HEAD@{3}: revert: Revert "WIP: accidental file added to demonstrate undo"</w:t>
-      </w:r>
-    </w:p>
-    <w:p>
-      <w:pPr>
-        <w:shd w:fill="1E1E1E" w:val="clear"/>
-        <w:spacing w:after="0" w:before="0" w:line="240"/>
-      </w:pPr>
-      <w:r>
-        <w:rPr>
-          <w:rFonts w:ascii="Consolas" w:cs="Consolas" w:eastAsia="Consolas" w:hAnsi="Consolas"/>
-          <w:color w:val="E6EDF3"/>
-          <w:sz w:val="16"/>
-          <w:szCs w:val="16"/>
-        </w:rPr>
-        <w:t xml:space="preserve">261005b HEAD@{4}: reset: moving to 261005b7206bbb8c812ed2b1a267d14de95fe799</w:t>
-      </w:r>
-    </w:p>
-    <w:p>
-      <w:pPr>
-        <w:shd w:fill="1E1E1E" w:val="clear"/>
-        <w:spacing w:after="0" w:before="0" w:line="240"/>
-      </w:pPr>
-      <w:r>
-        <w:rPr>
-          <w:rFonts w:ascii="Consolas" w:cs="Consolas" w:eastAsia="Consolas" w:hAnsi="Consolas"/>
-          <w:color w:val="E6EDF3"/>
-          <w:sz w:val="16"/>
-          <w:szCs w:val="16"/>
-        </w:rPr>
-        <w:t xml:space="preserve">67f4658 HEAD@{5}: reset: moving to HEAD~1</w:t>
-      </w:r>
-    </w:p>
-    <w:p>
-      <w:pPr>
-        <w:shd w:fill="1E1E1E" w:val="clear"/>
-        <w:spacing w:after="0" w:before="0" w:line="240"/>
-      </w:pPr>
-      <w:r>
-        <w:rPr>
-          <w:rFonts w:ascii="Consolas" w:cs="Consolas" w:eastAsia="Consolas" w:hAnsi="Consolas"/>
-          <w:color w:val="E6EDF3"/>
-          <w:sz w:val="16"/>
-          <w:szCs w:val="16"/>
-        </w:rPr>
-        <w:t xml:space="preserve">261005b HEAD@{6}: commit: WIP: accidental file added to demonstrate undo</w:t>
-      </w:r>
-    </w:p>
-    <w:p>
-      <w:pPr>
-        <w:shd w:fill="1E1E1E" w:val="clear"/>
-        <w:spacing w:after="0" w:before="0" w:line="240"/>
-      </w:pPr>
-      <w:r>
-        <w:rPr>
-          <w:rFonts w:ascii="Consolas" w:cs="Consolas" w:eastAsia="Consolas" w:hAnsi="Consolas"/>
-          <w:color w:val="E6EDF3"/>
-          <w:sz w:val="16"/>
-          <w:szCs w:val="16"/>
-        </w:rPr>
-        <w:t xml:space="preserve">67f4658 HEAD@{7}: checkout: moving from main to practice/undo-recovery</w:t>
-      </w:r>
-    </w:p>
-    <w:p>
-      <w:pPr>
-        <w:shd w:fill="1E1E1E" w:val="clear"/>
-        <w:spacing w:after="0" w:before="0" w:line="240"/>
-      </w:pPr>
-      <w:r>
-        <w:rPr>
-          <w:rFonts w:ascii="Consolas" w:cs="Consolas" w:eastAsia="Consolas" w:hAnsi="Consolas"/>
-          <w:color w:val="E6EDF3"/>
-          <w:sz w:val="16"/>
-          <w:szCs w:val="16"/>
-        </w:rPr>
-        <w:t xml:space="preserve">67f4658 HEAD@{8}: commit: Fix GitHub Pages black screen by serving the compiled app</w:t>
-      </w:r>
-    </w:p>
-    <w:p>
-      <w:pPr>
-        <w:shd w:fill="1E1E1E" w:val="clear"/>
-        <w:spacing w:after="160" w:before="0" w:line="240"/>
-      </w:pPr>
-      <w:r>
-        <w:rPr>
-          <w:rFonts w:ascii="Consolas" w:cs="Consolas" w:eastAsia="Consolas" w:hAnsi="Consolas"/>
-          <w:color w:val="E6EDF3"/>
-          <w:sz w:val="16"/>
-          <w:szCs w:val="16"/>
-        </w:rPr>
-        <w:t xml:space="preserve">0d76397 HEAD@{9}: clone: from https://github.com/sayem4/software_project.git</w:t>
-      </w:r>
-    </w:p>
-    <w:p>
-      <w:pPr>
-        <w:spacing w:after="80" w:before="120"/>
+        <w:spacing w:after="0" w:before="80" w:line="230"/>
+      </w:pPr>
+      <w:r>
+        <w:rPr>
+          <w:rFonts w:ascii="Consolas" w:cs="Consolas" w:eastAsia="Consolas" w:hAnsi="Consolas"/>
+          <w:color w:val="E6EDF3"/>
+          <w:sz w:val="15"/>
+          <w:szCs w:val="15"/>
+        </w:rPr>
+        <w:t xml:space="preserve">a528fb7 HEAD@{0}: merge origin/main: Merge made by the 'ort' strategy.</w:t>
+      </w:r>
+    </w:p>
+    <w:p>
+      <w:pPr>
+        <w:shd w:fill="1E1E1E" w:val="clear"/>
+        <w:spacing w:after="0" w:before="0" w:line="230"/>
+      </w:pPr>
+      <w:r>
+        <w:rPr>
+          <w:rFonts w:ascii="Consolas" w:cs="Consolas" w:eastAsia="Consolas" w:hAnsi="Consolas"/>
+          <w:color w:val="E6EDF3"/>
+          <w:sz w:val="15"/>
+          <w:szCs w:val="15"/>
+        </w:rPr>
+        <w:t xml:space="preserve">b6815cb HEAD@{1}: commit: Add Git workflow assignment report with live command evidence</w:t>
+      </w:r>
+    </w:p>
+    <w:p>
+      <w:pPr>
+        <w:shd w:fill="1E1E1E" w:val="clear"/>
+        <w:spacing w:after="0" w:before="0" w:line="230"/>
+      </w:pPr>
+      <w:r>
+        <w:rPr>
+          <w:rFonts w:ascii="Consolas" w:cs="Consolas" w:eastAsia="Consolas" w:hAnsi="Consolas"/>
+          <w:color w:val="E6EDF3"/>
+          <w:sz w:val="15"/>
+          <w:szCs w:val="15"/>
+        </w:rPr>
+        <w:t xml:space="preserve">1c9a84e HEAD@{2}: merge practice/undo-recovery: Merge made by the 'ort' strategy.</w:t>
+      </w:r>
+    </w:p>
+    <w:p>
+      <w:pPr>
+        <w:shd w:fill="1E1E1E" w:val="clear"/>
+        <w:spacing w:after="0" w:before="0" w:line="230"/>
+      </w:pPr>
+      <w:r>
+        <w:rPr>
+          <w:rFonts w:ascii="Consolas" w:cs="Consolas" w:eastAsia="Consolas" w:hAnsi="Consolas"/>
+          <w:color w:val="E6EDF3"/>
+          <w:sz w:val="15"/>
+          <w:szCs w:val="15"/>
+        </w:rPr>
+        <w:t xml:space="preserve">67f4658 HEAD@{3}: checkout: moving from practice/undo-recovery to main</w:t>
+      </w:r>
+    </w:p>
+    <w:p>
+      <w:pPr>
+        <w:shd w:fill="1E1E1E" w:val="clear"/>
+        <w:spacing w:after="0" w:before="0" w:line="230"/>
+      </w:pPr>
+      <w:r>
+        <w:rPr>
+          <w:rFonts w:ascii="Consolas" w:cs="Consolas" w:eastAsia="Consolas" w:hAnsi="Consolas"/>
+          <w:color w:val="E6EDF3"/>
+          <w:sz w:val="15"/>
+          <w:szCs w:val="15"/>
+        </w:rPr>
+        <w:t xml:space="preserve">8300196 HEAD@{4}: commit: Document undo, reflog recovery, and safe revert</w:t>
+      </w:r>
+    </w:p>
+    <w:p>
+      <w:pPr>
+        <w:shd w:fill="1E1E1E" w:val="clear"/>
+        <w:spacing w:after="0" w:before="0" w:line="230"/>
+      </w:pPr>
+      <w:r>
+        <w:rPr>
+          <w:rFonts w:ascii="Consolas" w:cs="Consolas" w:eastAsia="Consolas" w:hAnsi="Consolas"/>
+          <w:color w:val="E6EDF3"/>
+          <w:sz w:val="15"/>
+          <w:szCs w:val="15"/>
+        </w:rPr>
+        <w:t xml:space="preserve">8712897 HEAD@{5}: revert: Revert "WIP: accidental file added to demonstrate undo"</w:t>
+      </w:r>
+    </w:p>
+    <w:p>
+      <w:pPr>
+        <w:shd w:fill="1E1E1E" w:val="clear"/>
+        <w:spacing w:after="0" w:before="0" w:line="230"/>
+      </w:pPr>
+      <w:r>
+        <w:rPr>
+          <w:rFonts w:ascii="Consolas" w:cs="Consolas" w:eastAsia="Consolas" w:hAnsi="Consolas"/>
+          <w:color w:val="E6EDF3"/>
+          <w:sz w:val="15"/>
+          <w:szCs w:val="15"/>
+        </w:rPr>
+        <w:t xml:space="preserve">261005b HEAD@{6}: reset: moving to 261005b7206bbb8c812ed2b1a267d14de95fe799</w:t>
+      </w:r>
+    </w:p>
+    <w:p>
+      <w:pPr>
+        <w:shd w:fill="1E1E1E" w:val="clear"/>
+        <w:spacing w:after="0" w:before="0" w:line="230"/>
+      </w:pPr>
+      <w:r>
+        <w:rPr>
+          <w:rFonts w:ascii="Consolas" w:cs="Consolas" w:eastAsia="Consolas" w:hAnsi="Consolas"/>
+          <w:color w:val="E6EDF3"/>
+          <w:sz w:val="15"/>
+          <w:szCs w:val="15"/>
+        </w:rPr>
+        <w:t xml:space="preserve">67f4658 HEAD@{7}: reset: moving to HEAD~1</w:t>
+      </w:r>
+    </w:p>
+    <w:p>
+      <w:pPr>
+        <w:shd w:fill="1E1E1E" w:val="clear"/>
+        <w:spacing w:after="0" w:before="0" w:line="230"/>
+      </w:pPr>
+      <w:r>
+        <w:rPr>
+          <w:rFonts w:ascii="Consolas" w:cs="Consolas" w:eastAsia="Consolas" w:hAnsi="Consolas"/>
+          <w:color w:val="E6EDF3"/>
+          <w:sz w:val="15"/>
+          <w:szCs w:val="15"/>
+        </w:rPr>
+        <w:t xml:space="preserve">261005b HEAD@{8}: commit: WIP: accidental file added to demonstrate undo</w:t>
+      </w:r>
+    </w:p>
+    <w:p>
+      <w:pPr>
+        <w:shd w:fill="1E1E1E" w:val="clear"/>
+        <w:spacing w:after="0" w:before="0" w:line="230"/>
+      </w:pPr>
+      <w:r>
+        <w:rPr>
+          <w:rFonts w:ascii="Consolas" w:cs="Consolas" w:eastAsia="Consolas" w:hAnsi="Consolas"/>
+          <w:color w:val="E6EDF3"/>
+          <w:sz w:val="15"/>
+          <w:szCs w:val="15"/>
+        </w:rPr>
+        <w:t xml:space="preserve">67f4658 HEAD@{9}: checkout: moving from main to practice/undo-recovery</w:t>
+      </w:r>
+    </w:p>
+    <w:p>
+      <w:pPr>
+        <w:shd w:fill="1E1E1E" w:val="clear"/>
+        <w:spacing w:after="0" w:before="0" w:line="230"/>
+      </w:pPr>
+      <w:r>
+        <w:rPr>
+          <w:rFonts w:ascii="Consolas" w:cs="Consolas" w:eastAsia="Consolas" w:hAnsi="Consolas"/>
+          <w:color w:val="E6EDF3"/>
+          <w:sz w:val="15"/>
+          <w:szCs w:val="15"/>
+        </w:rPr>
+        <w:t xml:space="preserve">67f4658 HEAD@{10}: commit: Fix GitHub Pages black screen by serving the compiled app</w:t>
+      </w:r>
+    </w:p>
+    <w:p>
+      <w:pPr>
+        <w:shd w:fill="1E1E1E" w:val="clear"/>
+        <w:spacing w:after="160" w:before="0" w:line="230"/>
+      </w:pPr>
+      <w:r>
+        <w:rPr>
+          <w:rFonts w:ascii="Consolas" w:cs="Consolas" w:eastAsia="Consolas" w:hAnsi="Consolas"/>
+          <w:color w:val="E6EDF3"/>
+          <w:sz w:val="15"/>
+          <w:szCs w:val="15"/>
+        </w:rPr>
+        <w:t xml:space="preserve">0d76397 HEAD@{11}: clone: from https://github.com/sayem4/software_project.git</w:t>
+      </w:r>
+    </w:p>
+    <w:p>
+      <w:pPr>
+        <w:spacing w:after="60" w:before="80"/>
       </w:pPr>
       <w:r>
         <w:rPr>
@@ -3938,24 +4165,24 @@
           <w:bCs/>
           <w:i/>
           <w:iCs/>
-          <w:color w:val="555555"/>
+          <w:color w:val="4A4A4A"/>
           <w:sz w:val="20"/>
           <w:szCs w:val="20"/>
         </w:rPr>
-        <w:t xml:space="preserve">Figure 4. git reflog -20</w:t>
-      </w:r>
-    </w:p>
-    <w:p>
-      <w:pPr>
-        <w:spacing w:after="80"/>
+        <w:t xml:space="preserve">Figure 4. git reflog -15</w:t>
+      </w:r>
+    </w:p>
+    <w:p>
+      <w:pPr>
+        <w:spacing w:after="40"/>
         <w:jc w:val="center"/>
       </w:pPr>
       <w:r>
         <w:drawing>
           <wp:inline distT="0" distB="0" distL="0" distR="0">
-            <wp:extent cx="5905500" cy="1838325"/>
+            <wp:extent cx="5905500" cy="2076450"/>
             <wp:effectExtent t="0" r="0" b="0" l="0"/>
-            <wp:docPr id="1" name="Figure 4. git reflog -20" descr="Reflog showing the accidental reset, the recovery of 261005b, the revert, and the merge into main." title="Figure 4. git reflog -20"/>
+            <wp:docPr id="1" name="Figure 4. git reflog -15" descr="Reflog showing the accidental reset of 261005b, the recovery, the revert 8712897, and later merges." title="Figure 4. git reflog -15"/>
             <wp:cNvGraphicFramePr>
               <a:graphicFrameLocks xmlns:a="http://schemas.openxmlformats.org/drawingml/2006/main" noChangeAspect="1"/>
             </wp:cNvGraphicFramePr>
@@ -3978,7 +4205,7 @@
                   <pic:spPr bwMode="auto">
                     <a:xfrm>
                       <a:off x="0" y="0"/>
-                      <a:ext cx="5905500" cy="1838325"/>
+                      <a:ext cx="5905500" cy="2076450"/>
                     </a:xfrm>
                     <a:prstGeom prst="rect">
                       <a:avLst/>
@@ -3993,7 +4220,7 @@
     </w:p>
     <w:p>
       <w:pPr>
-        <w:spacing w:after="200" w:before="0" w:line="276"/>
+        <w:spacing w:after="180" w:before="0" w:line="276"/>
         <w:jc w:val="center"/>
       </w:pPr>
       <w:r>
@@ -4003,11 +4230,11 @@
           <w:bCs w:val="false"/>
           <w:i/>
           <w:iCs/>
-          <w:color w:val="555555"/>
+          <w:color w:val="4A4A4A"/>
           <w:sz w:val="18"/>
           <w:szCs w:val="18"/>
         </w:rPr>
-        <w:t xml:space="preserve">Figure. Live output captured from the project working tree.</w:t>
+        <w:t xml:space="preserve">Captured from the live working tree of sayem4/software_project.</w:t>
       </w:r>
     </w:p>
     <w:p>
@@ -4025,13 +4252,13 @@
           <w:sz w:val="22"/>
           <w:szCs w:val="22"/>
         </w:rPr>
-        <w:t xml:space="preserve">HEAD@{5} is the accidental reset. HEAD@{4} is the recovery. HEAD@{3} is the revert. Those three lines are the recovery story in one place.</w:t>
+        <w:t xml:space="preserve">In the reflog, HEAD@{7} is the accidental reset (moving to HEAD~1). HEAD@{6} is the recovery (reset back to 261005b). HEAD@{5} is the revert. Those three lines are the recovery story.</w:t>
       </w:r>
     </w:p>
     <w:p>
       <w:pPr>
         <w:pStyle w:val="Heading2"/>
-        <w:spacing w:after="140" w:before="240"/>
+        <w:spacing w:after="120" w:before="220"/>
       </w:pPr>
       <w:r>
         <w:rPr>
@@ -4060,13 +4287,13 @@
           <w:sz w:val="22"/>
           <w:szCs w:val="22"/>
         </w:rPr>
-        <w:t xml:space="preserve">fe8616e, d39aed6, d4e0860, d102f7b, 727f70c, 3b228e5, a46126a, 946de78, a388209, 546fed8, 0c4d1bf, f06fa27, 0d76397, 67f4658, 261005b, 8712897, 8300196, 1c9a84e.</w:t>
+        <w:t xml:space="preserve">More than six hashes are used in the explanation above. The main ones are: fe8616e (initial commit), d4e0860 and d102f7b (homepage-ui), 727f70c and 3b228e5 (auth-flow), a46126a and 946de78 (local-hosting), a388209, 546fed8 and 0c4d1bf (merge conflict), 0d76397 (v1.0.0), 261005b, 8712897 and 1c9a84e (undo and recovery).</w:t>
       </w:r>
     </w:p>
     <w:p>
       <w:pPr>
         <w:pStyle w:val="Heading2"/>
-        <w:spacing w:after="140" w:before="240"/>
+        <w:spacing w:after="120" w:before="220"/>
       </w:pPr>
       <w:r>
         <w:rPr>
@@ -4191,7 +4418,7 @@
           <w:sz w:val="22"/>
           <w:szCs w:val="22"/>
         </w:rPr>
-        <w:t xml:space="preserve">A release tag (v1.0.0 → 0d76397) names a snapshot without freezing main. Later fixes such as 67f4658 can land without retagging history.</w:t>
+        <w:t xml:space="preserve">A release tag (v1.0.0 at 0d76397) names a snapshot without freezing main. Later fixes can land without retagging history.</w:t>
       </w:r>
     </w:p>
     <w:p>
@@ -4229,7 +4456,7 @@
           <w:sz w:val="22"/>
           <w:szCs w:val="22"/>
         </w:rPr>
-        <w:t xml:space="preserve">The repository link, the six-plus hashes, and the four required command listings all come from the same clone. Nothing here is reconstructed from memory.</w:t>
+        <w:t xml:space="preserve">The repository link, the six-plus hashes, and the four required command listings all come from https://github.com/sayem4/software_project. Nothing here is reconstructed from memory.</w:t>
       </w:r>
     </w:p>
     <w:p>
@@ -4248,11 +4475,11 @@
           <w:bCs w:val="false"/>
           <w:i/>
           <w:iCs/>
-          <w:color w:val="555555"/>
-          <w:sz w:val="22"/>
-          <w:szCs w:val="22"/>
-        </w:rPr>
-        <w:t xml:space="preserve">End of report. Approximately 1,850 words. Evidence files live in docs/git-evidence/ next to this document in the same repository.</w:t>
+          <w:color w:val="4A4A4A"/>
+          <w:sz w:val="22"/>
+          <w:szCs w:val="22"/>
+        </w:rPr>
+        <w:t xml:space="preserve">End of report. Approximately 1,700 words of prose, plus command output and four screenshots.</w:t>
       </w:r>
     </w:p>
     <w:sectPr>
@@ -4322,7 +4549,7 @@
     <w:r>
       <w:rPr>
         <w:rFonts w:ascii="Arial" w:cs="Arial" w:eastAsia="Arial" w:hAnsi="Arial"/>
-        <w:color w:val="555555"/>
+        <w:color w:val="4A4A4A"/>
         <w:sz w:val="16"/>
         <w:szCs w:val="16"/>
       </w:rPr>
@@ -4331,7 +4558,7 @@
     <w:r>
       <w:rPr>
         <w:rFonts w:ascii="Arial" w:cs="Arial" w:eastAsia="Arial" w:hAnsi="Arial"/>
-        <w:color w:val="555555"/>
+        <w:color w:val="4A4A4A"/>
         <w:sz w:val="16"/>
         <w:szCs w:val="16"/>
       </w:rPr>
@@ -4340,7 +4567,7 @@
     <w:r>
       <w:rPr>
         <w:rFonts w:ascii="Arial" w:cs="Arial" w:eastAsia="Arial" w:hAnsi="Arial"/>
-        <w:color w:val="555555"/>
+        <w:color w:val="4A4A4A"/>
         <w:sz w:val="16"/>
         <w:szCs w:val="16"/>
       </w:rPr>
@@ -4411,7 +4638,7 @@
         <w:sz w:val="16"/>
         <w:szCs w:val="16"/>
       </w:rPr>
-      <w:t xml:space="preserve">Lumière Restaurant Website  —  Git Workflow Report</w:t>
+      <w:t xml:space="preserve">Lumiere Restaurant Website  |  Git Workflow Report</w:t>
     </w:r>
     <w:r>
       <w:rPr>
@@ -4528,6 +4755,18 @@
     <w:multiLevelType w:val="hybridMultilevel"/>
     <w:lvl w:ilvl="0" w15:tentative="1">
       <w:start w:val="1"/>
+      <w:numFmt w:val="decimal"/>
+      <w:lvlText w:val="%1."/>
+      <w:lvlJc w:val="left"/>
+      <w:pPr>
+        <w:ind w:left="720" w:hanging="360"/>
+      </w:pPr>
+    </w:lvl>
+  </w:abstractNum>
+  <w:abstractNum w:abstractNumId="4" w15:restartNumberingAfterBreak="0">
+    <w:multiLevelType w:val="hybridMultilevel"/>
+    <w:lvl w:ilvl="0" w15:tentative="1">
+      <w:start w:val="1"/>
       <w:numFmt w:val="bullet"/>
       <w:lvlText w:val="•"/>
       <w:lvlJc w:val="left"/>
@@ -4543,13 +4782,13 @@
     </w:lvlOverride>
   </w:num>
   <w:num w:numId="2">
-    <w:abstractNumId w:val="2"/>
+    <w:abstractNumId w:val="3"/>
     <w:lvlOverride w:ilvl="0">
       <w:startOverride w:val="1"/>
     </w:lvlOverride>
   </w:num>
   <w:num w:numId="3">
-    <w:abstractNumId w:val="3"/>
+    <w:abstractNumId w:val="4"/>
     <w:lvlOverride w:ilvl="0">
       <w:startOverride w:val="1"/>
     </w:lvlOverride>
@@ -4746,7 +4985,7 @@
     <w:next w:val="Normal"/>
     <w:qFormat/>
     <w:pPr>
-      <w:spacing w:after="200" w:before="320"/>
+      <w:spacing w:after="180" w:before="280"/>
       <w:outlineLvl w:val="0"/>
     </w:pPr>
     <w:rPr>
@@ -4764,7 +5003,7 @@
     <w:next w:val="Normal"/>
     <w:qFormat/>
     <w:pPr>
-      <w:spacing w:after="140" w:before="240"/>
+      <w:spacing w:after="120" w:before="220"/>
       <w:outlineLvl w:val="1"/>
     </w:pPr>
     <w:rPr>

</xml_diff>

<commit_message>
Add application UI screenshots to the Git workflow report
</commit_message>
<xml_diff>
--- a/docs/Git_Workflow_Report.docx
+++ b/docs/Git_Workflow_Report.docx
@@ -563,7 +563,7 @@
       <w:pPr>
         <w:spacing w:after="160"/>
       </w:pPr>
-      <w:hyperlink w:history="1" r:id="rIdoqyovyrps1pjirqvdpbxg">
+      <w:hyperlink w:history="1" r:id="rIdhkjczhpv4mkctn0qwjlzo">
         <w:r>
           <w:rPr>
             <w:rStyle w:val="Hyperlink"/>
@@ -683,6 +683,391 @@
           <w:szCs w:val="22"/>
         </w:rPr>
         <w:t xml:space="preserve">The first commit on the remote is fe8616e (Initial commit for GitHub Pages deployment). The Pages workflow was corrected in ce123e6. Feature work was then split onto three branches, merged back to main, a merge conflict was created and resolved in the README, and a release was tagged as v1.0.0 at 0d76397. Later Pages fixes landed in 67f4658 and 07fcdd6. Undo and recovery were practised on practice/undo-recovery (261005b, 8712897, 8300196) and merged in 1c9a84e. This report itself is commit b6815cb. Current main is a528fb7.</w:t>
+      </w:r>
+    </w:p>
+    <w:p>
+      <w:pPr>
+        <w:pStyle w:val="Heading2"/>
+        <w:spacing w:after="120" w:before="220"/>
+      </w:pPr>
+      <w:r>
+        <w:rPr>
+          <w:rFonts w:ascii="Arial" w:cs="Arial" w:eastAsia="Arial" w:hAnsi="Arial"/>
+          <w:b/>
+          <w:bCs/>
+          <w:color w:val="8A6D3B"/>
+          <w:sz w:val="24"/>
+          <w:szCs w:val="24"/>
+        </w:rPr>
+        <w:t xml:space="preserve">Application UI</w:t>
+      </w:r>
+    </w:p>
+    <w:p>
+      <w:pPr>
+        <w:spacing w:after="160" w:before="0" w:line="276"/>
+      </w:pPr>
+      <w:r>
+        <w:rPr>
+          <w:rFonts w:ascii="Arial" w:cs="Arial" w:eastAsia="Arial" w:hAnsi="Arial"/>
+          <w:b w:val="false"/>
+          <w:bCs w:val="false"/>
+          <w:i w:val="false"/>
+          <w:iCs w:val="false"/>
+          <w:color w:val="222222"/>
+          <w:sz w:val="22"/>
+          <w:szCs w:val="22"/>
+        </w:rPr>
+        <w:t xml:space="preserve">The screenshots below were taken from the running application at http://127.0.0.1:4173/software_project/ (the same build published on GitHub Pages). They show the homepage hero, the seasonal menu, the sign-in screen, and the reservations section.</w:t>
+      </w:r>
+    </w:p>
+    <w:p>
+      <w:pPr>
+        <w:spacing w:after="60" w:before="80"/>
+      </w:pPr>
+      <w:r>
+        <w:rPr>
+          <w:rFonts w:ascii="Arial" w:cs="Arial" w:eastAsia="Arial" w:hAnsi="Arial"/>
+          <w:b/>
+          <w:bCs/>
+          <w:i/>
+          <w:iCs/>
+          <w:color w:val="4A4A4A"/>
+          <w:sz w:val="20"/>
+          <w:szCs w:val="20"/>
+        </w:rPr>
+        <w:t xml:space="preserve">Figure A. Homepage hero — Lumiere landing page</w:t>
+      </w:r>
+    </w:p>
+    <w:p>
+      <w:pPr>
+        <w:spacing w:after="40"/>
+        <w:jc w:val="center"/>
+      </w:pPr>
+      <w:r>
+        <w:drawing>
+          <wp:inline distT="0" distB="0" distL="0" distR="0">
+            <wp:extent cx="5905500" cy="3695700"/>
+            <wp:effectExtent t="0" r="0" b="0" l="0"/>
+            <wp:docPr id="1" name="Figure A. Homepage hero — Lumiere landing page" descr="Lumiere homepage hero with tagline Where every plate tells a story, Reserve a Table and Explore the Menu buttons, and restaurant interior background." title="Figure A. Homepage hero — Lumiere landing page"/>
+            <wp:cNvGraphicFramePr>
+              <a:graphicFrameLocks xmlns:a="http://schemas.openxmlformats.org/drawingml/2006/main" noChangeAspect="1"/>
+            </wp:cNvGraphicFramePr>
+            <a:graphic xmlns:a="http://schemas.openxmlformats.org/drawingml/2006/main">
+              <a:graphicData uri="http://schemas.openxmlformats.org/drawingml/2006/picture">
+                <pic:pic xmlns:pic="http://schemas.openxmlformats.org/drawingml/2006/picture">
+                  <pic:nvPicPr>
+                    <pic:cNvPr id="0" name="" descr=""/>
+                    <pic:cNvPicPr>
+                      <a:picLocks noChangeAspect="1" noChangeArrowheads="1"/>
+                    </pic:cNvPicPr>
+                  </pic:nvPicPr>
+                  <pic:blipFill>
+                    <a:blip r:embed="rId9" cstate="none"/>
+                    <a:srcRect/>
+                    <a:stretch>
+                      <a:fillRect/>
+                    </a:stretch>
+                  </pic:blipFill>
+                  <pic:spPr bwMode="auto">
+                    <a:xfrm>
+                      <a:off x="0" y="0"/>
+                      <a:ext cx="5905500" cy="3695700"/>
+                    </a:xfrm>
+                    <a:prstGeom prst="rect">
+                      <a:avLst/>
+                    </a:prstGeom>
+                  </pic:spPr>
+                </pic:pic>
+              </a:graphicData>
+            </a:graphic>
+          </wp:inline>
+        </w:drawing>
+      </w:r>
+    </w:p>
+    <w:p>
+      <w:pPr>
+        <w:spacing w:after="180" w:before="0" w:line="276"/>
+        <w:jc w:val="center"/>
+      </w:pPr>
+      <w:r>
+        <w:rPr>
+          <w:rFonts w:ascii="Arial" w:cs="Arial" w:eastAsia="Arial" w:hAnsi="Arial"/>
+          <w:b w:val="false"/>
+          <w:bCs w:val="false"/>
+          <w:i/>
+          <w:iCs/>
+          <w:color w:val="4A4A4A"/>
+          <w:sz w:val="18"/>
+          <w:szCs w:val="18"/>
+        </w:rPr>
+        <w:t xml:space="preserve">Captured from the live working tree of sayem4/software_project.</w:t>
+      </w:r>
+    </w:p>
+    <w:p>
+      <w:pPr>
+        <w:spacing w:after="60" w:before="80"/>
+      </w:pPr>
+      <w:r>
+        <w:rPr>
+          <w:rFonts w:ascii="Arial" w:cs="Arial" w:eastAsia="Arial" w:hAnsi="Arial"/>
+          <w:b/>
+          <w:bCs/>
+          <w:i/>
+          <w:iCs/>
+          <w:color w:val="4A4A4A"/>
+          <w:sz w:val="20"/>
+          <w:szCs w:val="20"/>
+        </w:rPr>
+        <w:t xml:space="preserve">Figure B. Menu page — seasonal selection and dishes</w:t>
+      </w:r>
+    </w:p>
+    <w:p>
+      <w:pPr>
+        <w:spacing w:after="40"/>
+        <w:jc w:val="center"/>
+      </w:pPr>
+      <w:r>
+        <w:drawing>
+          <wp:inline distT="0" distB="0" distL="0" distR="0">
+            <wp:extent cx="5905500" cy="3695700"/>
+            <wp:effectExtent t="0" r="0" b="0" l="0"/>
+            <wp:docPr id="1" name="Figure B. Menu page — seasonal selection and dishes" descr="Menu page with Appetizers, First Course, Main Course, Desserts and Cellar categories plus dish cards and prices." title="Figure B. Menu page — seasonal selection and dishes"/>
+            <wp:cNvGraphicFramePr>
+              <a:graphicFrameLocks xmlns:a="http://schemas.openxmlformats.org/drawingml/2006/main" noChangeAspect="1"/>
+            </wp:cNvGraphicFramePr>
+            <a:graphic xmlns:a="http://schemas.openxmlformats.org/drawingml/2006/main">
+              <a:graphicData uri="http://schemas.openxmlformats.org/drawingml/2006/picture">
+                <pic:pic xmlns:pic="http://schemas.openxmlformats.org/drawingml/2006/picture">
+                  <pic:nvPicPr>
+                    <pic:cNvPr id="0" name="" descr=""/>
+                    <pic:cNvPicPr>
+                      <a:picLocks noChangeAspect="1" noChangeArrowheads="1"/>
+                    </pic:cNvPicPr>
+                  </pic:nvPicPr>
+                  <pic:blipFill>
+                    <a:blip r:embed="rId10" cstate="none"/>
+                    <a:srcRect/>
+                    <a:stretch>
+                      <a:fillRect/>
+                    </a:stretch>
+                  </pic:blipFill>
+                  <pic:spPr bwMode="auto">
+                    <a:xfrm>
+                      <a:off x="0" y="0"/>
+                      <a:ext cx="5905500" cy="3695700"/>
+                    </a:xfrm>
+                    <a:prstGeom prst="rect">
+                      <a:avLst/>
+                    </a:prstGeom>
+                  </pic:spPr>
+                </pic:pic>
+              </a:graphicData>
+            </a:graphic>
+          </wp:inline>
+        </w:drawing>
+      </w:r>
+    </w:p>
+    <w:p>
+      <w:pPr>
+        <w:spacing w:after="180" w:before="0" w:line="276"/>
+        <w:jc w:val="center"/>
+      </w:pPr>
+      <w:r>
+        <w:rPr>
+          <w:rFonts w:ascii="Arial" w:cs="Arial" w:eastAsia="Arial" w:hAnsi="Arial"/>
+          <w:b w:val="false"/>
+          <w:bCs w:val="false"/>
+          <w:i/>
+          <w:iCs/>
+          <w:color w:val="4A4A4A"/>
+          <w:sz w:val="18"/>
+          <w:szCs w:val="18"/>
+        </w:rPr>
+        <w:t xml:space="preserve">Captured from the live working tree of sayem4/software_project.</w:t>
+      </w:r>
+    </w:p>
+    <w:p>
+      <w:pPr>
+        <w:spacing w:after="60" w:before="80"/>
+      </w:pPr>
+      <w:r>
+        <w:rPr>
+          <w:rFonts w:ascii="Arial" w:cs="Arial" w:eastAsia="Arial" w:hAnsi="Arial"/>
+          <w:b/>
+          <w:bCs/>
+          <w:i/>
+          <w:iCs/>
+          <w:color w:val="4A4A4A"/>
+          <w:sz w:val="20"/>
+          <w:szCs w:val="20"/>
+        </w:rPr>
+        <w:t xml:space="preserve">Figure C. Sign-in page — authentication flow</w:t>
+      </w:r>
+    </w:p>
+    <w:p>
+      <w:pPr>
+        <w:spacing w:after="40"/>
+        <w:jc w:val="center"/>
+      </w:pPr>
+      <w:r>
+        <w:drawing>
+          <wp:inline distT="0" distB="0" distL="0" distR="0">
+            <wp:extent cx="5905500" cy="3695700"/>
+            <wp:effectExtent t="0" r="0" b="0" l="0"/>
+            <wp:docPr id="1" name="Figure C. Sign-in page — authentication flow" descr="Sign in to Lumiere screen with email and password fields, Sign In and Sign Up tabs, and a restaurant interior photo." title="Figure C. Sign-in page — authentication flow"/>
+            <wp:cNvGraphicFramePr>
+              <a:graphicFrameLocks xmlns:a="http://schemas.openxmlformats.org/drawingml/2006/main" noChangeAspect="1"/>
+            </wp:cNvGraphicFramePr>
+            <a:graphic xmlns:a="http://schemas.openxmlformats.org/drawingml/2006/main">
+              <a:graphicData uri="http://schemas.openxmlformats.org/drawingml/2006/picture">
+                <pic:pic xmlns:pic="http://schemas.openxmlformats.org/drawingml/2006/picture">
+                  <pic:nvPicPr>
+                    <pic:cNvPr id="0" name="" descr=""/>
+                    <pic:cNvPicPr>
+                      <a:picLocks noChangeAspect="1" noChangeArrowheads="1"/>
+                    </pic:cNvPicPr>
+                  </pic:nvPicPr>
+                  <pic:blipFill>
+                    <a:blip r:embed="rId11" cstate="none"/>
+                    <a:srcRect/>
+                    <a:stretch>
+                      <a:fillRect/>
+                    </a:stretch>
+                  </pic:blipFill>
+                  <pic:spPr bwMode="auto">
+                    <a:xfrm>
+                      <a:off x="0" y="0"/>
+                      <a:ext cx="5905500" cy="3695700"/>
+                    </a:xfrm>
+                    <a:prstGeom prst="rect">
+                      <a:avLst/>
+                    </a:prstGeom>
+                  </pic:spPr>
+                </pic:pic>
+              </a:graphicData>
+            </a:graphic>
+          </wp:inline>
+        </w:drawing>
+      </w:r>
+    </w:p>
+    <w:p>
+      <w:pPr>
+        <w:spacing w:after="180" w:before="0" w:line="276"/>
+        <w:jc w:val="center"/>
+      </w:pPr>
+      <w:r>
+        <w:rPr>
+          <w:rFonts w:ascii="Arial" w:cs="Arial" w:eastAsia="Arial" w:hAnsi="Arial"/>
+          <w:b w:val="false"/>
+          <w:bCs w:val="false"/>
+          <w:i/>
+          <w:iCs/>
+          <w:color w:val="4A4A4A"/>
+          <w:sz w:val="18"/>
+          <w:szCs w:val="18"/>
+        </w:rPr>
+        <w:t xml:space="preserve">Captured from the live working tree of sayem4/software_project.</w:t>
+      </w:r>
+    </w:p>
+    <w:p>
+      <w:pPr>
+        <w:spacing w:after="60" w:before="80"/>
+      </w:pPr>
+      <w:r>
+        <w:rPr>
+          <w:rFonts w:ascii="Arial" w:cs="Arial" w:eastAsia="Arial" w:hAnsi="Arial"/>
+          <w:b/>
+          <w:bCs/>
+          <w:i/>
+          <w:iCs/>
+          <w:color w:val="4A4A4A"/>
+          <w:sz w:val="20"/>
+          <w:szCs w:val="20"/>
+        </w:rPr>
+        <w:t xml:space="preserve">Figure D. Reservations section — book a table</w:t>
+      </w:r>
+    </w:p>
+    <w:p>
+      <w:pPr>
+        <w:spacing w:after="40"/>
+        <w:jc w:val="center"/>
+      </w:pPr>
+      <w:r>
+        <w:drawing>
+          <wp:inline distT="0" distB="0" distL="0" distR="0">
+            <wp:extent cx="5905500" cy="3695700"/>
+            <wp:effectExtent t="0" r="0" b="0" l="0"/>
+            <wp:docPr id="1" name="Figure D. Reservations section — book a table" descr="Reservations banner Reserve your evening with a Book a Table button and Upcoming events below." title="Figure D. Reservations section — book a table"/>
+            <wp:cNvGraphicFramePr>
+              <a:graphicFrameLocks xmlns:a="http://schemas.openxmlformats.org/drawingml/2006/main" noChangeAspect="1"/>
+            </wp:cNvGraphicFramePr>
+            <a:graphic xmlns:a="http://schemas.openxmlformats.org/drawingml/2006/main">
+              <a:graphicData uri="http://schemas.openxmlformats.org/drawingml/2006/picture">
+                <pic:pic xmlns:pic="http://schemas.openxmlformats.org/drawingml/2006/picture">
+                  <pic:nvPicPr>
+                    <pic:cNvPr id="0" name="" descr=""/>
+                    <pic:cNvPicPr>
+                      <a:picLocks noChangeAspect="1" noChangeArrowheads="1"/>
+                    </pic:cNvPicPr>
+                  </pic:nvPicPr>
+                  <pic:blipFill>
+                    <a:blip r:embed="rId12" cstate="none"/>
+                    <a:srcRect/>
+                    <a:stretch>
+                      <a:fillRect/>
+                    </a:stretch>
+                  </pic:blipFill>
+                  <pic:spPr bwMode="auto">
+                    <a:xfrm>
+                      <a:off x="0" y="0"/>
+                      <a:ext cx="5905500" cy="3695700"/>
+                    </a:xfrm>
+                    <a:prstGeom prst="rect">
+                      <a:avLst/>
+                    </a:prstGeom>
+                  </pic:spPr>
+                </pic:pic>
+              </a:graphicData>
+            </a:graphic>
+          </wp:inline>
+        </w:drawing>
+      </w:r>
+    </w:p>
+    <w:p>
+      <w:pPr>
+        <w:spacing w:after="180" w:before="0" w:line="276"/>
+        <w:jc w:val="center"/>
+      </w:pPr>
+      <w:r>
+        <w:rPr>
+          <w:rFonts w:ascii="Arial" w:cs="Arial" w:eastAsia="Arial" w:hAnsi="Arial"/>
+          <w:b w:val="false"/>
+          <w:bCs w:val="false"/>
+          <w:i/>
+          <w:iCs/>
+          <w:color w:val="4A4A4A"/>
+          <w:sz w:val="18"/>
+          <w:szCs w:val="18"/>
+        </w:rPr>
+        <w:t xml:space="preserve">Captured from the live working tree of sayem4/software_project.</w:t>
+      </w:r>
+    </w:p>
+    <w:p>
+      <w:pPr>
+        <w:spacing w:after="160" w:before="0" w:line="276"/>
+      </w:pPr>
+      <w:r>
+        <w:rPr>
+          <w:rFonts w:ascii="Arial" w:cs="Arial" w:eastAsia="Arial" w:hAnsi="Arial"/>
+          <w:b w:val="false"/>
+          <w:bCs w:val="false"/>
+          <w:i w:val="false"/>
+          <w:iCs w:val="false"/>
+          <w:color w:val="222222"/>
+          <w:sz w:val="22"/>
+          <w:szCs w:val="22"/>
+        </w:rPr>
+        <w:t xml:space="preserve">Live site: https://sayem4.github.io/software_project/</w:t>
       </w:r>
     </w:p>
     <w:p>
@@ -3566,7 +3951,7 @@
                     </pic:cNvPicPr>
                   </pic:nvPicPr>
                   <pic:blipFill>
-                    <a:blip r:embed="rId9" cstate="none"/>
+                    <a:blip r:embed="rId13" cstate="none"/>
                     <a:srcRect/>
                     <a:stretch>
                       <a:fillRect/>
@@ -3801,7 +4186,7 @@
                     </pic:cNvPicPr>
                   </pic:nvPicPr>
                   <pic:blipFill>
-                    <a:blip r:embed="rId10" cstate="none"/>
+                    <a:blip r:embed="rId14" cstate="none"/>
                     <a:srcRect/>
                     <a:stretch>
                       <a:fillRect/>
@@ -3916,7 +4301,7 @@
                     </pic:cNvPicPr>
                   </pic:nvPicPr>
                   <pic:blipFill>
-                    <a:blip r:embed="rId11" cstate="none"/>
+                    <a:blip r:embed="rId15" cstate="none"/>
                     <a:srcRect/>
                     <a:stretch>
                       <a:fillRect/>
@@ -4196,7 +4581,7 @@
                     </pic:cNvPicPr>
                   </pic:nvPicPr>
                   <pic:blipFill>
-                    <a:blip r:embed="rId12" cstate="none"/>
+                    <a:blip r:embed="rId16" cstate="none"/>
                     <a:srcRect/>
                     <a:stretch>
                       <a:fillRect/>

</xml_diff>